<commit_message>
Update portfolio resume to latest version
</commit_message>
<xml_diff>
--- a/docs/resume.docx
+++ b/docs/resume.docx
@@ -6,14 +6,14 @@
       <w:pPr>
         <w:spacing w:line="360" w:lineRule="auto"/>
         <w:rPr>
-          <w:rFonts w:ascii="Arial" w:hAnsi="Arial" w:cs="Arial"/>
-          <w:sz w:val="16"/>
-          <w:szCs w:val="16"/>
-        </w:rPr>
-      </w:pPr>
-      <w:r>
-        <w:rPr>
-          <w:rFonts w:ascii="Arial" w:hAnsi="Arial" w:cs="Arial"/>
+          <w:rFonts w:ascii="Times New Roman" w:hAnsi="Times New Roman" w:cs="Times New Roman"/>
+          <w:sz w:val="20"/>
+          <w:szCs w:val="20"/>
+        </w:rPr>
+      </w:pPr>
+      <w:r>
+        <w:rPr>
+          <w:rFonts w:ascii="Times New Roman" w:hAnsi="Times New Roman" w:cs="Times New Roman"/>
           <w:b/>
           <w:bCs/>
           <w:sz w:val="28"/>
@@ -23,41 +23,34 @@
       </w:r>
       <w:r>
         <w:rPr>
-          <w:rFonts w:ascii="Arial" w:hAnsi="Arial" w:cs="Arial"/>
-          <w:sz w:val="16"/>
-          <w:szCs w:val="16"/>
+          <w:rFonts w:ascii="Times New Roman" w:hAnsi="Times New Roman" w:cs="Times New Roman"/>
+          <w:sz w:val="20"/>
+          <w:szCs w:val="20"/>
         </w:rPr>
         <w:br/>
       </w:r>
       <w:r>
         <w:rPr>
-          <w:rFonts w:ascii="Arial" w:hAnsi="Arial" w:cs="Arial"/>
-          <w:b/>
-          <w:bCs/>
-          <w:sz w:val="18"/>
-          <w:szCs w:val="18"/>
+          <w:rFonts w:ascii="Times New Roman" w:hAnsi="Times New Roman" w:cs="Times New Roman"/>
+          <w:b/>
+          <w:bCs/>
+          <w:sz w:val="20"/>
+          <w:szCs w:val="20"/>
         </w:rPr>
         <w:t>Software Engineer | Java Backend &amp; Full Stack | Scalable Systems | Cloud</w:t>
       </w:r>
       <w:r>
         <w:rPr>
-          <w:rFonts w:ascii="Arial" w:hAnsi="Arial" w:cs="Arial"/>
-          <w:sz w:val="18"/>
-          <w:szCs w:val="18"/>
+          <w:rFonts w:ascii="Times New Roman" w:hAnsi="Times New Roman" w:cs="Times New Roman"/>
+          <w:sz w:val="20"/>
+          <w:szCs w:val="20"/>
         </w:rPr>
         <w:br/>
-      </w:r>
-      <w:r>
-        <w:rPr>
-          <w:rFonts w:ascii="Arial" w:hAnsi="Arial" w:cs="Arial"/>
-          <w:sz w:val="20"/>
-          <w:szCs w:val="20"/>
-        </w:rPr>
         <w:t>mohammedrafi.java@gmail.com | +91 7386796653</w:t>
       </w:r>
       <w:r>
         <w:rPr>
-          <w:rFonts w:ascii="Arial" w:hAnsi="Arial" w:cs="Arial"/>
+          <w:rFonts w:ascii="Times New Roman" w:hAnsi="Times New Roman" w:cs="Times New Roman"/>
           <w:sz w:val="20"/>
           <w:szCs w:val="20"/>
         </w:rPr>
@@ -65,25 +58,17 @@
       </w:r>
       <w:r>
         <w:rPr>
-          <w:rFonts w:ascii="Arial" w:hAnsi="Arial" w:cs="Arial"/>
-          <w:sz w:val="20"/>
-          <w:szCs w:val="20"/>
-        </w:rPr>
-        <w:t>|</w:t>
-      </w:r>
-      <w:r>
-        <w:rPr>
-          <w:rFonts w:ascii="Arial" w:hAnsi="Arial" w:cs="Arial"/>
-          <w:sz w:val="20"/>
-          <w:szCs w:val="20"/>
-        </w:rPr>
-        <w:t xml:space="preserve"> </w:t>
+          <w:rFonts w:ascii="Times New Roman" w:hAnsi="Times New Roman" w:cs="Times New Roman"/>
+          <w:sz w:val="20"/>
+          <w:szCs w:val="20"/>
+        </w:rPr>
+        <w:t xml:space="preserve">| </w:t>
       </w:r>
       <w:hyperlink r:id="rId5" w:tgtFrame="_new" w:history="1">
         <w:r>
           <w:rPr>
             <w:rStyle w:val="Hyperlink"/>
-            <w:rFonts w:ascii="Arial" w:hAnsi="Arial" w:cs="Arial"/>
+            <w:rFonts w:ascii="Times New Roman" w:hAnsi="Times New Roman" w:cs="Times New Roman"/>
             <w:sz w:val="20"/>
             <w:szCs w:val="20"/>
           </w:rPr>
@@ -92,28 +77,26 @@
       </w:hyperlink>
       <w:r>
         <w:rPr>
-          <w:rFonts w:ascii="Arial" w:hAnsi="Arial" w:cs="Arial"/>
+          <w:rFonts w:ascii="Times New Roman" w:hAnsi="Times New Roman" w:cs="Times New Roman"/>
           <w:sz w:val="20"/>
           <w:szCs w:val="20"/>
         </w:rPr>
         <w:t xml:space="preserve"> |  </w:t>
       </w:r>
       <w:hyperlink r:id="rId6" w:tgtFrame="_new" w:history="1">
-        <w:proofErr w:type="spellStart"/>
         <w:r>
           <w:rPr>
             <w:rStyle w:val="Hyperlink"/>
-            <w:rFonts w:ascii="Arial" w:hAnsi="Arial" w:cs="Arial"/>
+            <w:rFonts w:ascii="Times New Roman" w:hAnsi="Times New Roman" w:cs="Times New Roman"/>
             <w:sz w:val="20"/>
             <w:szCs w:val="20"/>
           </w:rPr>
           <w:t>LeetCode</w:t>
         </w:r>
-        <w:proofErr w:type="spellEnd"/>
       </w:hyperlink>
       <w:r>
         <w:rPr>
-          <w:rFonts w:ascii="Arial" w:hAnsi="Arial" w:cs="Arial"/>
+          <w:rFonts w:ascii="Times New Roman" w:hAnsi="Times New Roman" w:cs="Times New Roman"/>
           <w:sz w:val="20"/>
           <w:szCs w:val="20"/>
         </w:rPr>
@@ -123,28 +106,47 @@
         <w:r>
           <w:rPr>
             <w:rStyle w:val="Hyperlink"/>
-            <w:rFonts w:ascii="Arial" w:hAnsi="Arial" w:cs="Arial"/>
+            <w:rFonts w:ascii="Times New Roman" w:hAnsi="Times New Roman" w:cs="Times New Roman"/>
             <w:sz w:val="20"/>
             <w:szCs w:val="20"/>
           </w:rPr>
           <w:t>GitHub</w:t>
         </w:r>
       </w:hyperlink>
-    </w:p>
-    <w:p>
-      <w:pPr>
-        <w:spacing w:line="360" w:lineRule="auto"/>
-        <w:rPr>
-          <w:rFonts w:ascii="Arial" w:hAnsi="Arial" w:cs="Arial"/>
-          <w:sz w:val="16"/>
-          <w:szCs w:val="16"/>
-        </w:rPr>
-      </w:pPr>
-      <w:r>
-        <w:rPr>
-          <w:rFonts w:ascii="Arial" w:hAnsi="Arial" w:cs="Arial"/>
-          <w:sz w:val="16"/>
-          <w:szCs w:val="16"/>
+      <w:r>
+        <w:rPr>
+          <w:rFonts w:ascii="Times New Roman" w:hAnsi="Times New Roman" w:cs="Times New Roman"/>
+          <w:sz w:val="20"/>
+          <w:szCs w:val="20"/>
+        </w:rPr>
+        <w:t xml:space="preserve"> | </w:t>
+      </w:r>
+      <w:hyperlink r:id="rId8" w:tgtFrame="_blank" w:history="1">
+        <w:r>
+          <w:rPr>
+            <w:rStyle w:val="Hyperlink"/>
+            <w:rFonts w:ascii="Times New Roman" w:hAnsi="Times New Roman" w:cs="Times New Roman"/>
+            <w:sz w:val="20"/>
+            <w:szCs w:val="20"/>
+          </w:rPr>
+          <w:t>Rafi Tech Portfolio</w:t>
+        </w:r>
+      </w:hyperlink>
+    </w:p>
+    <w:p>
+      <w:pPr>
+        <w:spacing w:line="360" w:lineRule="auto"/>
+        <w:rPr>
+          <w:rFonts w:ascii="Times New Roman" w:hAnsi="Times New Roman" w:cs="Times New Roman"/>
+          <w:sz w:val="20"/>
+          <w:szCs w:val="20"/>
+        </w:rPr>
+      </w:pPr>
+      <w:r>
+        <w:rPr>
+          <w:rFonts w:ascii="Times New Roman" w:hAnsi="Times New Roman" w:cs="Times New Roman"/>
+          <w:sz w:val="20"/>
+          <w:szCs w:val="20"/>
         </w:rPr>
         <w:pict w14:anchorId="5E0A7AE4">
           <v:rect id="_x0000_i1025" style="width:0;height:1.5pt" o:hralign="center" o:hrstd="t" o:hr="t" fillcolor="#a0a0a0" stroked="f"/>
@@ -155,21 +157,21 @@
       <w:pPr>
         <w:spacing w:line="360" w:lineRule="auto"/>
         <w:rPr>
-          <w:rFonts w:ascii="Arial" w:hAnsi="Arial" w:cs="Arial"/>
-          <w:b/>
-          <w:bCs/>
-          <w:sz w:val="16"/>
-          <w:szCs w:val="16"/>
+          <w:rFonts w:ascii="Times New Roman" w:hAnsi="Times New Roman" w:cs="Times New Roman"/>
+          <w:b/>
+          <w:bCs/>
+          <w:sz w:val="20"/>
+          <w:szCs w:val="20"/>
           <w:u w:val="single"/>
         </w:rPr>
       </w:pPr>
       <w:r>
         <w:rPr>
-          <w:rFonts w:ascii="Arial" w:hAnsi="Arial" w:cs="Arial"/>
-          <w:b/>
-          <w:bCs/>
-          <w:sz w:val="16"/>
-          <w:szCs w:val="16"/>
+          <w:rFonts w:ascii="Times New Roman" w:hAnsi="Times New Roman" w:cs="Times New Roman"/>
+          <w:b/>
+          <w:bCs/>
+          <w:sz w:val="20"/>
+          <w:szCs w:val="20"/>
           <w:u w:val="single"/>
         </w:rPr>
         <w:t>Professional Summary:</w:t>
@@ -180,136 +182,136 @@
         <w:spacing w:line="360" w:lineRule="auto"/>
         <w:jc w:val="both"/>
         <w:rPr>
-          <w:rFonts w:ascii="Arial" w:hAnsi="Arial" w:cs="Arial"/>
-          <w:sz w:val="16"/>
-          <w:szCs w:val="16"/>
-        </w:rPr>
-      </w:pPr>
-      <w:r>
-        <w:rPr>
-          <w:rFonts w:ascii="Arial" w:hAnsi="Arial" w:cs="Arial"/>
-          <w:b/>
-          <w:bCs/>
-          <w:sz w:val="16"/>
-          <w:szCs w:val="16"/>
+          <w:rFonts w:ascii="Times New Roman" w:hAnsi="Times New Roman" w:cs="Times New Roman"/>
+          <w:sz w:val="20"/>
+          <w:szCs w:val="20"/>
+        </w:rPr>
+      </w:pPr>
+      <w:r>
+        <w:rPr>
+          <w:rFonts w:ascii="Times New Roman" w:hAnsi="Times New Roman" w:cs="Times New Roman"/>
+          <w:b/>
+          <w:bCs/>
+          <w:sz w:val="20"/>
+          <w:szCs w:val="20"/>
         </w:rPr>
         <w:t xml:space="preserve">Software Engineer with over </w:t>
       </w:r>
       <w:r>
         <w:rPr>
-          <w:rFonts w:ascii="Arial" w:hAnsi="Arial" w:cs="Arial"/>
-          <w:b/>
-          <w:bCs/>
-          <w:sz w:val="16"/>
-          <w:szCs w:val="16"/>
+          <w:rFonts w:ascii="Times New Roman" w:hAnsi="Times New Roman" w:cs="Times New Roman"/>
+          <w:b/>
+          <w:bCs/>
+          <w:sz w:val="20"/>
+          <w:szCs w:val="20"/>
         </w:rPr>
         <w:t>4+</w:t>
       </w:r>
       <w:r>
         <w:rPr>
-          <w:rFonts w:ascii="Arial" w:hAnsi="Arial" w:cs="Arial"/>
-          <w:b/>
-          <w:bCs/>
-          <w:sz w:val="16"/>
-          <w:szCs w:val="16"/>
+          <w:rFonts w:ascii="Times New Roman" w:hAnsi="Times New Roman" w:cs="Times New Roman"/>
+          <w:b/>
+          <w:bCs/>
+          <w:sz w:val="20"/>
+          <w:szCs w:val="20"/>
         </w:rPr>
         <w:t xml:space="preserve"> years of professional experience</w:t>
       </w:r>
       <w:r>
         <w:rPr>
-          <w:rFonts w:ascii="Arial" w:hAnsi="Arial" w:cs="Arial"/>
-          <w:sz w:val="16"/>
-          <w:szCs w:val="16"/>
+          <w:rFonts w:ascii="Times New Roman" w:hAnsi="Times New Roman" w:cs="Times New Roman"/>
+          <w:sz w:val="20"/>
+          <w:szCs w:val="20"/>
         </w:rPr>
         <w:t xml:space="preserve"> in backend and full-stack development using </w:t>
       </w:r>
       <w:r>
         <w:rPr>
-          <w:rFonts w:ascii="Arial" w:hAnsi="Arial" w:cs="Arial"/>
-          <w:b/>
-          <w:bCs/>
-          <w:sz w:val="16"/>
-          <w:szCs w:val="16"/>
+          <w:rFonts w:ascii="Times New Roman" w:hAnsi="Times New Roman" w:cs="Times New Roman"/>
+          <w:b/>
+          <w:bCs/>
+          <w:sz w:val="20"/>
+          <w:szCs w:val="20"/>
         </w:rPr>
         <w:t>Java, Python, and JavaScript</w:t>
       </w:r>
       <w:r>
         <w:rPr>
-          <w:rFonts w:ascii="Arial" w:hAnsi="Arial" w:cs="Arial"/>
-          <w:sz w:val="16"/>
-          <w:szCs w:val="16"/>
+          <w:rFonts w:ascii="Times New Roman" w:hAnsi="Times New Roman" w:cs="Times New Roman"/>
+          <w:sz w:val="20"/>
+          <w:szCs w:val="20"/>
         </w:rPr>
         <w:t xml:space="preserve">. Proven expertise in </w:t>
       </w:r>
       <w:r>
         <w:rPr>
-          <w:rFonts w:ascii="Arial" w:hAnsi="Arial" w:cs="Arial"/>
-          <w:b/>
-          <w:bCs/>
-          <w:sz w:val="16"/>
-          <w:szCs w:val="16"/>
+          <w:rFonts w:ascii="Times New Roman" w:hAnsi="Times New Roman" w:cs="Times New Roman"/>
+          <w:b/>
+          <w:bCs/>
+          <w:sz w:val="20"/>
+          <w:szCs w:val="20"/>
         </w:rPr>
         <w:t>system design, debugging, and scalability</w:t>
       </w:r>
       <w:r>
         <w:rPr>
-          <w:rFonts w:ascii="Arial" w:hAnsi="Arial" w:cs="Arial"/>
-          <w:sz w:val="16"/>
-          <w:szCs w:val="16"/>
+          <w:rFonts w:ascii="Times New Roman" w:hAnsi="Times New Roman" w:cs="Times New Roman"/>
+          <w:sz w:val="20"/>
+          <w:szCs w:val="20"/>
         </w:rPr>
         <w:t xml:space="preserve">, with hands-on experience in frameworks like </w:t>
       </w:r>
       <w:r>
         <w:rPr>
-          <w:rFonts w:ascii="Arial" w:hAnsi="Arial" w:cs="Arial"/>
-          <w:b/>
-          <w:bCs/>
-          <w:sz w:val="16"/>
-          <w:szCs w:val="16"/>
+          <w:rFonts w:ascii="Times New Roman" w:hAnsi="Times New Roman" w:cs="Times New Roman"/>
+          <w:b/>
+          <w:bCs/>
+          <w:sz w:val="20"/>
+          <w:szCs w:val="20"/>
         </w:rPr>
         <w:t>Spring Boot, Angular, and React</w:t>
       </w:r>
       <w:r>
         <w:rPr>
-          <w:rFonts w:ascii="Arial" w:hAnsi="Arial" w:cs="Arial"/>
-          <w:sz w:val="16"/>
-          <w:szCs w:val="16"/>
+          <w:rFonts w:ascii="Times New Roman" w:hAnsi="Times New Roman" w:cs="Times New Roman"/>
+          <w:sz w:val="20"/>
+          <w:szCs w:val="20"/>
         </w:rPr>
         <w:t xml:space="preserve">. Skilled in </w:t>
       </w:r>
       <w:r>
         <w:rPr>
-          <w:rFonts w:ascii="Arial" w:hAnsi="Arial" w:cs="Arial"/>
-          <w:b/>
-          <w:bCs/>
-          <w:sz w:val="16"/>
-          <w:szCs w:val="16"/>
+          <w:rFonts w:ascii="Times New Roman" w:hAnsi="Times New Roman" w:cs="Times New Roman"/>
+          <w:b/>
+          <w:bCs/>
+          <w:sz w:val="20"/>
+          <w:szCs w:val="20"/>
         </w:rPr>
         <w:t>deploying AWS-based scalable solutions</w:t>
       </w:r>
       <w:r>
         <w:rPr>
-          <w:rFonts w:ascii="Arial" w:hAnsi="Arial" w:cs="Arial"/>
-          <w:sz w:val="16"/>
-          <w:szCs w:val="16"/>
+          <w:rFonts w:ascii="Times New Roman" w:hAnsi="Times New Roman" w:cs="Times New Roman"/>
+          <w:sz w:val="20"/>
+          <w:szCs w:val="20"/>
         </w:rPr>
         <w:t xml:space="preserve">, optimizing performance, and solving complex challenges across distributed systems. A strong advocate for </w:t>
       </w:r>
       <w:r>
         <w:rPr>
-          <w:rFonts w:ascii="Arial" w:hAnsi="Arial" w:cs="Arial"/>
-          <w:b/>
-          <w:bCs/>
-          <w:sz w:val="16"/>
-          <w:szCs w:val="16"/>
+          <w:rFonts w:ascii="Times New Roman" w:hAnsi="Times New Roman" w:cs="Times New Roman"/>
+          <w:b/>
+          <w:bCs/>
+          <w:sz w:val="20"/>
+          <w:szCs w:val="20"/>
         </w:rPr>
         <w:t>code reviews, best practices, and test-driven development</w:t>
       </w:r>
       <w:r>
         <w:rPr>
-          <w:rFonts w:ascii="Arial" w:hAnsi="Arial" w:cs="Arial"/>
-          <w:sz w:val="16"/>
-          <w:szCs w:val="16"/>
+          <w:rFonts w:ascii="Times New Roman" w:hAnsi="Times New Roman" w:cs="Times New Roman"/>
+          <w:sz w:val="20"/>
+          <w:szCs w:val="20"/>
         </w:rPr>
         <w:t xml:space="preserve"> to deliver robust and maintainable software solutions.</w:t>
       </w:r>
@@ -318,18 +320,18 @@
       <w:pPr>
         <w:spacing w:line="360" w:lineRule="auto"/>
         <w:rPr>
-          <w:rFonts w:ascii="Arial" w:hAnsi="Arial" w:cs="Arial"/>
-          <w:b/>
-          <w:bCs/>
-          <w:sz w:val="16"/>
-          <w:szCs w:val="16"/>
-        </w:rPr>
-      </w:pPr>
-      <w:r>
-        <w:rPr>
-          <w:rFonts w:ascii="Arial" w:hAnsi="Arial" w:cs="Arial"/>
-          <w:sz w:val="16"/>
-          <w:szCs w:val="16"/>
+          <w:rFonts w:ascii="Times New Roman" w:hAnsi="Times New Roman" w:cs="Times New Roman"/>
+          <w:b/>
+          <w:bCs/>
+          <w:sz w:val="20"/>
+          <w:szCs w:val="20"/>
+        </w:rPr>
+      </w:pPr>
+      <w:r>
+        <w:rPr>
+          <w:rFonts w:ascii="Times New Roman" w:hAnsi="Times New Roman" w:cs="Times New Roman"/>
+          <w:sz w:val="20"/>
+          <w:szCs w:val="20"/>
         </w:rPr>
         <w:pict w14:anchorId="1AA2497E">
           <v:rect id="_x0000_i1026" style="width:0;height:1.5pt" o:hralign="center" o:hrstd="t" o:hr="t" fillcolor="#a0a0a0" stroked="f"/>
@@ -337,11 +339,11 @@
       </w:r>
       <w:r>
         <w:rPr>
-          <w:rFonts w:ascii="Arial" w:hAnsi="Arial" w:cs="Arial"/>
-          <w:b/>
-          <w:bCs/>
-          <w:sz w:val="16"/>
-          <w:szCs w:val="16"/>
+          <w:rFonts w:ascii="Times New Roman" w:hAnsi="Times New Roman" w:cs="Times New Roman"/>
+          <w:b/>
+          <w:bCs/>
+          <w:sz w:val="20"/>
+          <w:szCs w:val="20"/>
           <w:u w:val="single"/>
         </w:rPr>
         <w:t>Professional Experience:</w:t>
@@ -354,114 +356,92 @@
         </w:tabs>
         <w:spacing w:line="240" w:lineRule="auto"/>
         <w:rPr>
-          <w:rFonts w:ascii="Cambria" w:eastAsia="Cambria" w:hAnsi="Cambria" w:cs="Cambria"/>
-          <w:b/>
-          <w:bCs/>
-          <w:sz w:val="16"/>
-          <w:szCs w:val="16"/>
-        </w:rPr>
-      </w:pPr>
-      <w:r>
-        <w:rPr>
-          <w:rFonts w:ascii="Arial" w:eastAsia="Cambria" w:hAnsi="Arial" w:cs="Arial"/>
-          <w:b/>
-          <w:bCs/>
-          <w:sz w:val="16"/>
-          <w:szCs w:val="16"/>
+          <w:rFonts w:ascii="Times New Roman" w:eastAsia="Cambria" w:hAnsi="Times New Roman" w:cs="Times New Roman"/>
+          <w:b/>
+          <w:bCs/>
+          <w:sz w:val="20"/>
+          <w:szCs w:val="20"/>
+        </w:rPr>
+      </w:pPr>
+      <w:r>
+        <w:rPr>
+          <w:rFonts w:ascii="Times New Roman" w:eastAsia="Cambria" w:hAnsi="Times New Roman" w:cs="Times New Roman"/>
+          <w:b/>
+          <w:bCs/>
+          <w:sz w:val="20"/>
+          <w:szCs w:val="20"/>
         </w:rPr>
         <w:t>Pentagram Infotech Private Limited</w:t>
       </w:r>
       <w:r>
         <w:rPr>
-          <w:rFonts w:ascii="Arial" w:hAnsi="Arial" w:cs="Arial"/>
+          <w:rFonts w:ascii="Times New Roman" w:hAnsi="Times New Roman" w:cs="Times New Roman"/>
           <w:b/>
           <w:bCs/>
           <w:i/>
           <w:iCs/>
-          <w:sz w:val="16"/>
-          <w:szCs w:val="16"/>
+          <w:sz w:val="20"/>
+          <w:szCs w:val="20"/>
         </w:rPr>
         <w:t xml:space="preserve"> </w:t>
       </w:r>
       <w:r>
         <w:rPr>
-          <w:rFonts w:ascii="Arial" w:hAnsi="Arial" w:cs="Arial"/>
-          <w:b/>
-          <w:bCs/>
-          <w:sz w:val="16"/>
-          <w:szCs w:val="16"/>
-        </w:rPr>
-        <w:t xml:space="preserve">- </w:t>
-      </w:r>
-      <w:r>
-        <w:rPr>
-          <w:rFonts w:ascii="Arial" w:hAnsi="Arial" w:cs="Arial"/>
-          <w:b/>
-          <w:bCs/>
-          <w:sz w:val="16"/>
-          <w:szCs w:val="16"/>
-        </w:rPr>
-        <w:t>Software Engineer</w:t>
-      </w:r>
-      <w:r>
-        <w:rPr>
-          <w:rFonts w:ascii="Arial" w:hAnsi="Arial" w:cs="Arial"/>
-          <w:sz w:val="16"/>
-          <w:szCs w:val="16"/>
-        </w:rPr>
-        <w:t xml:space="preserve">                                                                             </w:t>
-      </w:r>
-      <w:r>
-        <w:rPr>
-          <w:rFonts w:ascii="Arial" w:hAnsi="Arial" w:cs="Arial"/>
+          <w:rFonts w:ascii="Times New Roman" w:hAnsi="Times New Roman" w:cs="Times New Roman"/>
+          <w:b/>
+          <w:bCs/>
+          <w:sz w:val="20"/>
+          <w:szCs w:val="20"/>
+        </w:rPr>
+        <w:t>- Software Engineer</w:t>
+      </w:r>
+      <w:r>
+        <w:rPr>
+          <w:rFonts w:ascii="Times New Roman" w:hAnsi="Times New Roman" w:cs="Times New Roman"/>
+          <w:sz w:val="20"/>
+          <w:szCs w:val="20"/>
+        </w:rPr>
+        <w:t xml:space="preserve">                                                  </w:t>
+      </w:r>
+      <w:r>
+        <w:rPr>
+          <w:rFonts w:ascii="Times New Roman" w:hAnsi="Times New Roman" w:cs="Times New Roman"/>
+          <w:sz w:val="20"/>
+          <w:szCs w:val="20"/>
+        </w:rPr>
+        <w:t xml:space="preserve"> </w:t>
+      </w:r>
+      <w:r>
+        <w:rPr>
+          <w:rFonts w:ascii="Times New Roman" w:hAnsi="Times New Roman" w:cs="Times New Roman"/>
           <w:i/>
           <w:iCs/>
-          <w:sz w:val="16"/>
-          <w:szCs w:val="16"/>
-        </w:rPr>
-        <w:t xml:space="preserve">January 2023 – </w:t>
-      </w:r>
-      <w:r>
-        <w:rPr>
-          <w:rFonts w:ascii="Arial" w:hAnsi="Arial" w:cs="Arial"/>
-          <w:i/>
-          <w:iCs/>
-          <w:sz w:val="16"/>
-          <w:szCs w:val="16"/>
-        </w:rPr>
-        <w:t>Present</w:t>
-      </w:r>
-    </w:p>
-    <w:p>
-      <w:pPr>
-        <w:spacing w:line="360" w:lineRule="auto"/>
-        <w:rPr>
-          <w:rFonts w:ascii="Arial" w:hAnsi="Arial" w:cs="Arial"/>
-          <w:b/>
-          <w:bCs/>
-          <w:sz w:val="16"/>
-          <w:szCs w:val="16"/>
-        </w:rPr>
-      </w:pPr>
-      <w:r>
-        <w:rPr>
-          <w:rFonts w:ascii="Arial" w:hAnsi="Arial" w:cs="Arial"/>
-          <w:b/>
-          <w:bCs/>
-          <w:sz w:val="16"/>
-          <w:szCs w:val="16"/>
-        </w:rPr>
-        <w:t xml:space="preserve">Client </w:t>
-      </w:r>
-      <w:r>
-        <w:rPr>
-          <w:rFonts w:ascii="Arial" w:hAnsi="Arial" w:cs="Arial"/>
-          <w:b/>
-          <w:bCs/>
-          <w:sz w:val="16"/>
-          <w:szCs w:val="16"/>
-        </w:rPr>
-        <w:t>: Elevance Health Inc (Anthem) – Healthcare Benefits Management System</w:t>
+          <w:sz w:val="20"/>
+          <w:szCs w:val="20"/>
+        </w:rPr>
+        <w:t>January 2023 – Present</w:t>
+      </w:r>
+    </w:p>
+    <w:p>
+      <w:pPr>
+        <w:spacing w:line="360" w:lineRule="auto"/>
+        <w:rPr>
+          <w:rFonts w:ascii="Times New Roman" w:hAnsi="Times New Roman" w:cs="Times New Roman"/>
+          <w:b/>
+          <w:bCs/>
+          <w:sz w:val="20"/>
+          <w:szCs w:val="20"/>
+        </w:rPr>
+      </w:pPr>
+      <w:r>
+        <w:rPr>
+          <w:rFonts w:ascii="Times New Roman" w:hAnsi="Times New Roman" w:cs="Times New Roman"/>
+          <w:b/>
+          <w:bCs/>
+          <w:sz w:val="20"/>
+          <w:szCs w:val="20"/>
+        </w:rPr>
+        <w:t>Client : Elevance Health Inc (Anthem) – Healthcare Benefits Management System</w:t>
       </w:r>
     </w:p>
     <w:p>
@@ -469,44 +449,44 @@
         <w:spacing w:line="360" w:lineRule="auto"/>
         <w:jc w:val="both"/>
         <w:rPr>
-          <w:rFonts w:ascii="Arial" w:hAnsi="Arial" w:cs="Arial"/>
-          <w:sz w:val="16"/>
-          <w:szCs w:val="16"/>
-        </w:rPr>
-      </w:pPr>
-      <w:r>
-        <w:rPr>
-          <w:rFonts w:ascii="Arial" w:hAnsi="Arial" w:cs="Arial"/>
-          <w:b/>
-          <w:bCs/>
-          <w:sz w:val="16"/>
-          <w:szCs w:val="16"/>
+          <w:rFonts w:ascii="Times New Roman" w:hAnsi="Times New Roman" w:cs="Times New Roman"/>
+          <w:sz w:val="20"/>
+          <w:szCs w:val="20"/>
+        </w:rPr>
+      </w:pPr>
+      <w:r>
+        <w:rPr>
+          <w:rFonts w:ascii="Times New Roman" w:hAnsi="Times New Roman" w:cs="Times New Roman"/>
+          <w:b/>
+          <w:bCs/>
+          <w:sz w:val="20"/>
+          <w:szCs w:val="20"/>
         </w:rPr>
         <w:t>Project Description:</w:t>
       </w:r>
       <w:r>
         <w:rPr>
-          <w:rFonts w:ascii="Arial" w:hAnsi="Arial" w:cs="Arial"/>
-          <w:sz w:val="16"/>
-          <w:szCs w:val="16"/>
+          <w:rFonts w:ascii="Times New Roman" w:hAnsi="Times New Roman" w:cs="Times New Roman"/>
+          <w:sz w:val="20"/>
+          <w:szCs w:val="20"/>
         </w:rPr>
         <w:t xml:space="preserve"> Elevance Health Inc (formerly Anthem) is a leading healthcare provider in the U.S., offering health insurance and benefits management solutions. The project involved developing and maintaining a </w:t>
       </w:r>
       <w:r>
         <w:rPr>
-          <w:rFonts w:ascii="Arial" w:hAnsi="Arial" w:cs="Arial"/>
-          <w:b/>
-          <w:bCs/>
-          <w:sz w:val="16"/>
-          <w:szCs w:val="16"/>
+          <w:rFonts w:ascii="Times New Roman" w:hAnsi="Times New Roman" w:cs="Times New Roman"/>
+          <w:b/>
+          <w:bCs/>
+          <w:sz w:val="20"/>
+          <w:szCs w:val="20"/>
         </w:rPr>
         <w:t>scalable, microservices-based healthcare platform</w:t>
       </w:r>
       <w:r>
         <w:rPr>
-          <w:rFonts w:ascii="Arial" w:hAnsi="Arial" w:cs="Arial"/>
-          <w:sz w:val="16"/>
-          <w:szCs w:val="16"/>
+          <w:rFonts w:ascii="Times New Roman" w:hAnsi="Times New Roman" w:cs="Times New Roman"/>
+          <w:sz w:val="20"/>
+          <w:szCs w:val="20"/>
         </w:rPr>
         <w:t xml:space="preserve"> that facilitated seamless communication between providers, patients, and payers.</w:t>
       </w:r>
@@ -519,26 +499,26 @@
         </w:numPr>
         <w:spacing w:line="360" w:lineRule="auto"/>
         <w:rPr>
-          <w:rFonts w:ascii="Arial" w:hAnsi="Arial" w:cs="Arial"/>
-          <w:sz w:val="16"/>
-          <w:szCs w:val="16"/>
-        </w:rPr>
-      </w:pPr>
-      <w:r>
-        <w:rPr>
-          <w:rFonts w:ascii="Arial" w:hAnsi="Arial" w:cs="Arial"/>
-          <w:b/>
-          <w:bCs/>
-          <w:sz w:val="16"/>
-          <w:szCs w:val="16"/>
+          <w:rFonts w:ascii="Times New Roman" w:hAnsi="Times New Roman" w:cs="Times New Roman"/>
+          <w:sz w:val="20"/>
+          <w:szCs w:val="20"/>
+        </w:rPr>
+      </w:pPr>
+      <w:r>
+        <w:rPr>
+          <w:rFonts w:ascii="Times New Roman" w:hAnsi="Times New Roman" w:cs="Times New Roman"/>
+          <w:b/>
+          <w:bCs/>
+          <w:sz w:val="20"/>
+          <w:szCs w:val="20"/>
         </w:rPr>
         <w:t>Developed core microservices in Java (Spring Boot)</w:t>
       </w:r>
       <w:r>
         <w:rPr>
-          <w:rFonts w:ascii="Arial" w:hAnsi="Arial" w:cs="Arial"/>
-          <w:sz w:val="16"/>
-          <w:szCs w:val="16"/>
+          <w:rFonts w:ascii="Times New Roman" w:hAnsi="Times New Roman" w:cs="Times New Roman"/>
+          <w:sz w:val="20"/>
+          <w:szCs w:val="20"/>
         </w:rPr>
         <w:t xml:space="preserve"> to handle insurance claims, policy management, and member enrollment, ensuring high availability and low-latency transactions.</w:t>
       </w:r>
@@ -551,44 +531,44 @@
         </w:numPr>
         <w:spacing w:line="360" w:lineRule="auto"/>
         <w:rPr>
-          <w:rFonts w:ascii="Arial" w:hAnsi="Arial" w:cs="Arial"/>
-          <w:sz w:val="16"/>
-          <w:szCs w:val="16"/>
-        </w:rPr>
-      </w:pPr>
-      <w:r>
-        <w:rPr>
-          <w:rFonts w:ascii="Arial" w:hAnsi="Arial" w:cs="Arial"/>
-          <w:b/>
-          <w:bCs/>
-          <w:sz w:val="16"/>
-          <w:szCs w:val="16"/>
+          <w:rFonts w:ascii="Times New Roman" w:hAnsi="Times New Roman" w:cs="Times New Roman"/>
+          <w:sz w:val="20"/>
+          <w:szCs w:val="20"/>
+        </w:rPr>
+      </w:pPr>
+      <w:r>
+        <w:rPr>
+          <w:rFonts w:ascii="Times New Roman" w:hAnsi="Times New Roman" w:cs="Times New Roman"/>
+          <w:b/>
+          <w:bCs/>
+          <w:sz w:val="20"/>
+          <w:szCs w:val="20"/>
         </w:rPr>
         <w:t>Optimized API performance</w:t>
       </w:r>
       <w:r>
         <w:rPr>
-          <w:rFonts w:ascii="Arial" w:hAnsi="Arial" w:cs="Arial"/>
-          <w:sz w:val="16"/>
-          <w:szCs w:val="16"/>
+          <w:rFonts w:ascii="Times New Roman" w:hAnsi="Times New Roman" w:cs="Times New Roman"/>
+          <w:sz w:val="20"/>
+          <w:szCs w:val="20"/>
         </w:rPr>
         <w:t xml:space="preserve"> by implementing caching mechanisms and reducing database query overhead, improving response times by </w:t>
       </w:r>
       <w:r>
         <w:rPr>
-          <w:rFonts w:ascii="Arial" w:hAnsi="Arial" w:cs="Arial"/>
-          <w:b/>
-          <w:bCs/>
-          <w:sz w:val="16"/>
-          <w:szCs w:val="16"/>
+          <w:rFonts w:ascii="Times New Roman" w:hAnsi="Times New Roman" w:cs="Times New Roman"/>
+          <w:b/>
+          <w:bCs/>
+          <w:sz w:val="20"/>
+          <w:szCs w:val="20"/>
         </w:rPr>
         <w:t>30%</w:t>
       </w:r>
       <w:r>
         <w:rPr>
-          <w:rFonts w:ascii="Arial" w:hAnsi="Arial" w:cs="Arial"/>
-          <w:sz w:val="16"/>
-          <w:szCs w:val="16"/>
+          <w:rFonts w:ascii="Times New Roman" w:hAnsi="Times New Roman" w:cs="Times New Roman"/>
+          <w:sz w:val="20"/>
+          <w:szCs w:val="20"/>
         </w:rPr>
         <w:t>.</w:t>
       </w:r>
@@ -601,44 +581,44 @@
         </w:numPr>
         <w:spacing w:line="360" w:lineRule="auto"/>
         <w:rPr>
-          <w:rFonts w:ascii="Arial" w:hAnsi="Arial" w:cs="Arial"/>
-          <w:sz w:val="16"/>
-          <w:szCs w:val="16"/>
-        </w:rPr>
-      </w:pPr>
-      <w:r>
-        <w:rPr>
-          <w:rFonts w:ascii="Arial" w:hAnsi="Arial" w:cs="Arial"/>
-          <w:b/>
-          <w:bCs/>
-          <w:sz w:val="16"/>
-          <w:szCs w:val="16"/>
+          <w:rFonts w:ascii="Times New Roman" w:hAnsi="Times New Roman" w:cs="Times New Roman"/>
+          <w:sz w:val="20"/>
+          <w:szCs w:val="20"/>
+        </w:rPr>
+      </w:pPr>
+      <w:r>
+        <w:rPr>
+          <w:rFonts w:ascii="Times New Roman" w:hAnsi="Times New Roman" w:cs="Times New Roman"/>
+          <w:b/>
+          <w:bCs/>
+          <w:sz w:val="20"/>
+          <w:szCs w:val="20"/>
         </w:rPr>
         <w:t>Streamlined deployment pipelines using AWS, Jenkins, and Docker</w:t>
       </w:r>
       <w:r>
         <w:rPr>
-          <w:rFonts w:ascii="Arial" w:hAnsi="Arial" w:cs="Arial"/>
-          <w:sz w:val="16"/>
-          <w:szCs w:val="16"/>
+          <w:rFonts w:ascii="Times New Roman" w:hAnsi="Times New Roman" w:cs="Times New Roman"/>
+          <w:sz w:val="20"/>
+          <w:szCs w:val="20"/>
         </w:rPr>
         <w:t xml:space="preserve">, reducing release cycle time by </w:t>
       </w:r>
       <w:r>
         <w:rPr>
-          <w:rFonts w:ascii="Arial" w:hAnsi="Arial" w:cs="Arial"/>
-          <w:b/>
-          <w:bCs/>
-          <w:sz w:val="16"/>
-          <w:szCs w:val="16"/>
+          <w:rFonts w:ascii="Times New Roman" w:hAnsi="Times New Roman" w:cs="Times New Roman"/>
+          <w:b/>
+          <w:bCs/>
+          <w:sz w:val="20"/>
+          <w:szCs w:val="20"/>
         </w:rPr>
         <w:t>40%</w:t>
       </w:r>
       <w:r>
         <w:rPr>
-          <w:rFonts w:ascii="Arial" w:hAnsi="Arial" w:cs="Arial"/>
-          <w:sz w:val="16"/>
-          <w:szCs w:val="16"/>
+          <w:rFonts w:ascii="Times New Roman" w:hAnsi="Times New Roman" w:cs="Times New Roman"/>
+          <w:sz w:val="20"/>
+          <w:szCs w:val="20"/>
         </w:rPr>
         <w:t xml:space="preserve"> and improving CI/CD efficiency.</w:t>
       </w:r>
@@ -651,34 +631,34 @@
         </w:numPr>
         <w:spacing w:line="360" w:lineRule="auto"/>
         <w:rPr>
-          <w:rFonts w:ascii="Arial" w:hAnsi="Arial" w:cs="Arial"/>
-          <w:sz w:val="16"/>
-          <w:szCs w:val="16"/>
-        </w:rPr>
-      </w:pPr>
-      <w:r>
-        <w:rPr>
-          <w:rFonts w:ascii="Arial" w:hAnsi="Arial" w:cs="Arial"/>
-          <w:sz w:val="16"/>
-          <w:szCs w:val="16"/>
+          <w:rFonts w:ascii="Times New Roman" w:hAnsi="Times New Roman" w:cs="Times New Roman"/>
+          <w:sz w:val="20"/>
+          <w:szCs w:val="20"/>
+        </w:rPr>
+      </w:pPr>
+      <w:r>
+        <w:rPr>
+          <w:rFonts w:ascii="Times New Roman" w:hAnsi="Times New Roman" w:cs="Times New Roman"/>
+          <w:sz w:val="20"/>
+          <w:szCs w:val="20"/>
         </w:rPr>
         <w:t xml:space="preserve">Collaborated with cross-functional teams to optimize API response times and database queries, achieving </w:t>
       </w:r>
       <w:r>
         <w:rPr>
-          <w:rFonts w:ascii="Arial" w:hAnsi="Arial" w:cs="Arial"/>
-          <w:b/>
-          <w:bCs/>
-          <w:sz w:val="16"/>
-          <w:szCs w:val="16"/>
+          <w:rFonts w:ascii="Times New Roman" w:hAnsi="Times New Roman" w:cs="Times New Roman"/>
+          <w:b/>
+          <w:bCs/>
+          <w:sz w:val="20"/>
+          <w:szCs w:val="20"/>
         </w:rPr>
         <w:t>30% improvement in system efficiency</w:t>
       </w:r>
       <w:r>
         <w:rPr>
-          <w:rFonts w:ascii="Arial" w:hAnsi="Arial" w:cs="Arial"/>
-          <w:sz w:val="16"/>
-          <w:szCs w:val="16"/>
+          <w:rFonts w:ascii="Times New Roman" w:hAnsi="Times New Roman" w:cs="Times New Roman"/>
+          <w:sz w:val="20"/>
+          <w:szCs w:val="20"/>
         </w:rPr>
         <w:t>.</w:t>
       </w:r>
@@ -691,26 +671,26 @@
         </w:numPr>
         <w:spacing w:line="360" w:lineRule="auto"/>
         <w:rPr>
-          <w:rFonts w:ascii="Arial" w:hAnsi="Arial" w:cs="Arial"/>
-          <w:sz w:val="16"/>
-          <w:szCs w:val="16"/>
-        </w:rPr>
-      </w:pPr>
-      <w:r>
-        <w:rPr>
-          <w:rFonts w:ascii="Arial" w:hAnsi="Arial" w:cs="Arial"/>
-          <w:b/>
-          <w:bCs/>
-          <w:sz w:val="16"/>
-          <w:szCs w:val="16"/>
+          <w:rFonts w:ascii="Times New Roman" w:hAnsi="Times New Roman" w:cs="Times New Roman"/>
+          <w:sz w:val="20"/>
+          <w:szCs w:val="20"/>
+        </w:rPr>
+      </w:pPr>
+      <w:r>
+        <w:rPr>
+          <w:rFonts w:ascii="Times New Roman" w:hAnsi="Times New Roman" w:cs="Times New Roman"/>
+          <w:b/>
+          <w:bCs/>
+          <w:sz w:val="20"/>
+          <w:szCs w:val="20"/>
         </w:rPr>
         <w:t>Led code reviews</w:t>
       </w:r>
       <w:r>
         <w:rPr>
-          <w:rFonts w:ascii="Arial" w:hAnsi="Arial" w:cs="Arial"/>
-          <w:sz w:val="16"/>
-          <w:szCs w:val="16"/>
+          <w:rFonts w:ascii="Times New Roman" w:hAnsi="Times New Roman" w:cs="Times New Roman"/>
+          <w:sz w:val="20"/>
+          <w:szCs w:val="20"/>
         </w:rPr>
         <w:t>, mentored junior developers, and ensured consistent, maintainable code across the team.</w:t>
       </w:r>
@@ -723,52 +703,52 @@
         </w:numPr>
         <w:spacing w:line="360" w:lineRule="auto"/>
         <w:rPr>
-          <w:rFonts w:ascii="Arial" w:hAnsi="Arial" w:cs="Arial"/>
-          <w:sz w:val="16"/>
-          <w:szCs w:val="16"/>
-        </w:rPr>
-      </w:pPr>
-      <w:r>
-        <w:rPr>
-          <w:rFonts w:ascii="Arial" w:hAnsi="Arial" w:cs="Arial"/>
-          <w:sz w:val="16"/>
-          <w:szCs w:val="16"/>
+          <w:rFonts w:ascii="Times New Roman" w:hAnsi="Times New Roman" w:cs="Times New Roman"/>
+          <w:sz w:val="20"/>
+          <w:szCs w:val="20"/>
+        </w:rPr>
+      </w:pPr>
+      <w:r>
+        <w:rPr>
+          <w:rFonts w:ascii="Times New Roman" w:hAnsi="Times New Roman" w:cs="Times New Roman"/>
+          <w:sz w:val="20"/>
+          <w:szCs w:val="20"/>
         </w:rPr>
         <w:t xml:space="preserve">Developed and maintained </w:t>
       </w:r>
       <w:r>
         <w:rPr>
-          <w:rFonts w:ascii="Arial" w:hAnsi="Arial" w:cs="Arial"/>
-          <w:b/>
-          <w:bCs/>
-          <w:sz w:val="16"/>
-          <w:szCs w:val="16"/>
+          <w:rFonts w:ascii="Times New Roman" w:hAnsi="Times New Roman" w:cs="Times New Roman"/>
+          <w:b/>
+          <w:bCs/>
+          <w:sz w:val="20"/>
+          <w:szCs w:val="20"/>
         </w:rPr>
         <w:t>RESTful APIs</w:t>
       </w:r>
       <w:r>
         <w:rPr>
-          <w:rFonts w:ascii="Arial" w:hAnsi="Arial" w:cs="Arial"/>
-          <w:sz w:val="16"/>
-          <w:szCs w:val="16"/>
+          <w:rFonts w:ascii="Times New Roman" w:hAnsi="Times New Roman" w:cs="Times New Roman"/>
+          <w:sz w:val="20"/>
+          <w:szCs w:val="20"/>
         </w:rPr>
         <w:t xml:space="preserve"> using Spring Boot, integrating with </w:t>
       </w:r>
       <w:r>
         <w:rPr>
-          <w:rFonts w:ascii="Arial" w:hAnsi="Arial" w:cs="Arial"/>
-          <w:b/>
-          <w:bCs/>
-          <w:sz w:val="16"/>
-          <w:szCs w:val="16"/>
+          <w:rFonts w:ascii="Times New Roman" w:hAnsi="Times New Roman" w:cs="Times New Roman"/>
+          <w:b/>
+          <w:bCs/>
+          <w:sz w:val="20"/>
+          <w:szCs w:val="20"/>
         </w:rPr>
         <w:t>MySQL</w:t>
       </w:r>
       <w:r>
         <w:rPr>
-          <w:rFonts w:ascii="Arial" w:hAnsi="Arial" w:cs="Arial"/>
-          <w:sz w:val="16"/>
-          <w:szCs w:val="16"/>
+          <w:rFonts w:ascii="Times New Roman" w:hAnsi="Times New Roman" w:cs="Times New Roman"/>
+          <w:sz w:val="20"/>
+          <w:szCs w:val="20"/>
         </w:rPr>
         <w:t xml:space="preserve"> for efficient data management.</w:t>
       </w:r>
@@ -781,34 +761,34 @@
         </w:numPr>
         <w:spacing w:line="360" w:lineRule="auto"/>
         <w:rPr>
-          <w:rFonts w:ascii="Arial" w:hAnsi="Arial" w:cs="Arial"/>
-          <w:sz w:val="16"/>
-          <w:szCs w:val="16"/>
-        </w:rPr>
-      </w:pPr>
-      <w:r>
-        <w:rPr>
-          <w:rFonts w:ascii="Arial" w:hAnsi="Arial" w:cs="Arial"/>
-          <w:sz w:val="16"/>
-          <w:szCs w:val="16"/>
+          <w:rFonts w:ascii="Times New Roman" w:hAnsi="Times New Roman" w:cs="Times New Roman"/>
+          <w:sz w:val="20"/>
+          <w:szCs w:val="20"/>
+        </w:rPr>
+      </w:pPr>
+      <w:r>
+        <w:rPr>
+          <w:rFonts w:ascii="Times New Roman" w:hAnsi="Times New Roman" w:cs="Times New Roman"/>
+          <w:sz w:val="20"/>
+          <w:szCs w:val="20"/>
         </w:rPr>
         <w:t xml:space="preserve">Created </w:t>
       </w:r>
       <w:r>
         <w:rPr>
-          <w:rFonts w:ascii="Arial" w:hAnsi="Arial" w:cs="Arial"/>
-          <w:b/>
-          <w:bCs/>
-          <w:sz w:val="16"/>
-          <w:szCs w:val="16"/>
+          <w:rFonts w:ascii="Times New Roman" w:hAnsi="Times New Roman" w:cs="Times New Roman"/>
+          <w:b/>
+          <w:bCs/>
+          <w:sz w:val="20"/>
+          <w:szCs w:val="20"/>
         </w:rPr>
         <w:t>UI components using Angular and React</w:t>
       </w:r>
       <w:r>
         <w:rPr>
-          <w:rFonts w:ascii="Arial" w:hAnsi="Arial" w:cs="Arial"/>
-          <w:sz w:val="16"/>
-          <w:szCs w:val="16"/>
+          <w:rFonts w:ascii="Times New Roman" w:hAnsi="Times New Roman" w:cs="Times New Roman"/>
+          <w:sz w:val="20"/>
+          <w:szCs w:val="20"/>
         </w:rPr>
         <w:t>, improving user experience and frontend-backend integration.</w:t>
       </w:r>
@@ -821,34 +801,35 @@
         </w:numPr>
         <w:spacing w:line="360" w:lineRule="auto"/>
         <w:rPr>
-          <w:rFonts w:ascii="Arial" w:hAnsi="Arial" w:cs="Arial"/>
-          <w:sz w:val="16"/>
-          <w:szCs w:val="16"/>
-        </w:rPr>
-      </w:pPr>
-      <w:r>
-        <w:rPr>
-          <w:rFonts w:ascii="Arial" w:hAnsi="Arial" w:cs="Arial"/>
-          <w:sz w:val="16"/>
-          <w:szCs w:val="16"/>
-        </w:rPr>
+          <w:rFonts w:ascii="Times New Roman" w:hAnsi="Times New Roman" w:cs="Times New Roman"/>
+          <w:sz w:val="20"/>
+          <w:szCs w:val="20"/>
+        </w:rPr>
+      </w:pPr>
+      <w:r>
+        <w:rPr>
+          <w:rFonts w:ascii="Times New Roman" w:hAnsi="Times New Roman" w:cs="Times New Roman"/>
+          <w:sz w:val="20"/>
+          <w:szCs w:val="20"/>
+        </w:rPr>
+        <w:lastRenderedPageBreak/>
         <w:t xml:space="preserve">Applied </w:t>
       </w:r>
       <w:r>
         <w:rPr>
-          <w:rFonts w:ascii="Arial" w:hAnsi="Arial" w:cs="Arial"/>
-          <w:b/>
-          <w:bCs/>
-          <w:sz w:val="16"/>
-          <w:szCs w:val="16"/>
+          <w:rFonts w:ascii="Times New Roman" w:hAnsi="Times New Roman" w:cs="Times New Roman"/>
+          <w:b/>
+          <w:bCs/>
+          <w:sz w:val="20"/>
+          <w:szCs w:val="20"/>
         </w:rPr>
         <w:t>Agile methodologies</w:t>
       </w:r>
       <w:r>
         <w:rPr>
-          <w:rFonts w:ascii="Arial" w:hAnsi="Arial" w:cs="Arial"/>
-          <w:sz w:val="16"/>
-          <w:szCs w:val="16"/>
+          <w:rFonts w:ascii="Times New Roman" w:hAnsi="Times New Roman" w:cs="Times New Roman"/>
+          <w:sz w:val="20"/>
+          <w:szCs w:val="20"/>
         </w:rPr>
         <w:t>, delivering features and fixes on time and ensuring smooth collaboration with external stakeholders.</w:t>
       </w:r>
@@ -857,16 +838,16 @@
       <w:pPr>
         <w:spacing w:line="360" w:lineRule="auto"/>
         <w:rPr>
-          <w:rFonts w:ascii="Arial" w:hAnsi="Arial" w:cs="Arial"/>
-          <w:sz w:val="16"/>
-          <w:szCs w:val="16"/>
-        </w:rPr>
-      </w:pPr>
-      <w:r>
-        <w:rPr>
-          <w:rFonts w:ascii="Arial" w:hAnsi="Arial" w:cs="Arial"/>
-          <w:sz w:val="16"/>
-          <w:szCs w:val="16"/>
+          <w:rFonts w:ascii="Times New Roman" w:hAnsi="Times New Roman" w:cs="Times New Roman"/>
+          <w:sz w:val="20"/>
+          <w:szCs w:val="20"/>
+        </w:rPr>
+      </w:pPr>
+      <w:r>
+        <w:rPr>
+          <w:rFonts w:ascii="Times New Roman" w:hAnsi="Times New Roman" w:cs="Times New Roman"/>
+          <w:sz w:val="20"/>
+          <w:szCs w:val="20"/>
         </w:rPr>
         <w:pict w14:anchorId="40CF5B44">
           <v:rect id="_x0000_i1027" style="width:0;height:1.5pt" o:hralign="center" o:hrstd="t" o:hr="t" fillcolor="#a0a0a0" stroked="f"/>
@@ -877,95 +858,38 @@
       <w:pPr>
         <w:spacing w:line="360" w:lineRule="auto"/>
         <w:rPr>
-          <w:rFonts w:ascii="Arial" w:hAnsi="Arial" w:cs="Arial"/>
-          <w:b/>
-          <w:bCs/>
-          <w:sz w:val="16"/>
-          <w:szCs w:val="16"/>
-        </w:rPr>
-      </w:pPr>
-    </w:p>
-    <w:p>
-      <w:pPr>
-        <w:spacing w:line="360" w:lineRule="auto"/>
-        <w:rPr>
-          <w:rFonts w:ascii="Arial" w:hAnsi="Arial" w:cs="Arial"/>
-          <w:b/>
-          <w:bCs/>
-          <w:sz w:val="16"/>
-          <w:szCs w:val="16"/>
-        </w:rPr>
-      </w:pPr>
-    </w:p>
-    <w:p>
-      <w:pPr>
-        <w:spacing w:line="360" w:lineRule="auto"/>
-        <w:rPr>
-          <w:rFonts w:ascii="Arial" w:hAnsi="Arial" w:cs="Arial"/>
-          <w:b/>
-          <w:bCs/>
-          <w:sz w:val="16"/>
-          <w:szCs w:val="16"/>
-        </w:rPr>
-      </w:pPr>
-    </w:p>
-    <w:p>
-      <w:pPr>
-        <w:spacing w:line="360" w:lineRule="auto"/>
-        <w:rPr>
-          <w:rFonts w:ascii="Arial" w:hAnsi="Arial" w:cs="Arial"/>
-          <w:b/>
-          <w:bCs/>
-          <w:sz w:val="16"/>
-          <w:szCs w:val="16"/>
-        </w:rPr>
-      </w:pPr>
-      <w:r>
-        <w:rPr>
-          <w:rFonts w:ascii="Arial" w:hAnsi="Arial" w:cs="Arial"/>
-          <w:b/>
-          <w:bCs/>
-          <w:sz w:val="16"/>
-          <w:szCs w:val="16"/>
-        </w:rPr>
-        <w:lastRenderedPageBreak/>
-        <w:t>Capgemini Technology Services India Ltd</w:t>
-      </w:r>
-      <w:r>
-        <w:rPr>
-          <w:rFonts w:ascii="Arial" w:hAnsi="Arial" w:cs="Arial"/>
-          <w:b/>
-          <w:bCs/>
-          <w:sz w:val="16"/>
-          <w:szCs w:val="16"/>
-        </w:rPr>
-        <w:t xml:space="preserve"> - </w:t>
-      </w:r>
-      <w:r>
-        <w:rPr>
-          <w:rFonts w:ascii="Arial" w:hAnsi="Arial" w:cs="Arial"/>
-          <w:b/>
-          <w:bCs/>
-          <w:sz w:val="16"/>
-          <w:szCs w:val="16"/>
-        </w:rPr>
-        <w:t>Associate Software Engineer</w:t>
-      </w:r>
-      <w:r>
-        <w:rPr>
-          <w:rFonts w:ascii="Arial" w:hAnsi="Arial" w:cs="Arial"/>
-          <w:sz w:val="16"/>
-          <w:szCs w:val="16"/>
-        </w:rPr>
-        <w:t xml:space="preserve">                                       </w:t>
-      </w:r>
-      <w:r>
-        <w:rPr>
-          <w:rFonts w:ascii="Arial" w:hAnsi="Arial" w:cs="Arial"/>
+          <w:rFonts w:ascii="Times New Roman" w:hAnsi="Times New Roman" w:cs="Times New Roman"/>
+          <w:b/>
+          <w:bCs/>
+          <w:sz w:val="20"/>
+          <w:szCs w:val="20"/>
+        </w:rPr>
+      </w:pPr>
+      <w:r>
+        <w:rPr>
+          <w:rFonts w:ascii="Times New Roman" w:hAnsi="Times New Roman" w:cs="Times New Roman"/>
+          <w:b/>
+          <w:bCs/>
+          <w:sz w:val="20"/>
+          <w:szCs w:val="20"/>
+        </w:rPr>
+        <w:t>Capgemini Technology Services India Ltd - Associate Software Engineer</w:t>
+      </w:r>
+      <w:r>
+        <w:rPr>
+          <w:rFonts w:ascii="Times New Roman" w:hAnsi="Times New Roman" w:cs="Times New Roman"/>
+          <w:sz w:val="20"/>
+          <w:szCs w:val="20"/>
+        </w:rPr>
+        <w:t xml:space="preserve">               </w:t>
+      </w:r>
+      <w:r>
+        <w:rPr>
+          <w:rFonts w:ascii="Times New Roman" w:hAnsi="Times New Roman" w:cs="Times New Roman"/>
           <w:i/>
           <w:iCs/>
-          <w:sz w:val="16"/>
-          <w:szCs w:val="16"/>
+          <w:sz w:val="20"/>
+          <w:szCs w:val="20"/>
         </w:rPr>
         <w:t>January 2022 – January 2023</w:t>
       </w:r>
@@ -974,84 +898,74 @@
       <w:pPr>
         <w:spacing w:line="360" w:lineRule="auto"/>
         <w:rPr>
-          <w:rFonts w:ascii="Arial" w:hAnsi="Arial" w:cs="Arial"/>
-          <w:b/>
-          <w:bCs/>
-          <w:sz w:val="16"/>
-          <w:szCs w:val="16"/>
-        </w:rPr>
-      </w:pPr>
-      <w:r>
-        <w:rPr>
-          <w:rFonts w:ascii="Arial" w:hAnsi="Arial" w:cs="Arial"/>
-          <w:b/>
-          <w:bCs/>
-          <w:sz w:val="16"/>
-          <w:szCs w:val="16"/>
-        </w:rPr>
-        <w:t xml:space="preserve">Client </w:t>
-      </w:r>
-      <w:r>
-        <w:rPr>
-          <w:rFonts w:ascii="Arial" w:hAnsi="Arial" w:cs="Arial"/>
-          <w:b/>
-          <w:bCs/>
-          <w:sz w:val="16"/>
-          <w:szCs w:val="16"/>
-        </w:rPr>
-        <w:t>: Bosch Global Software Technologies – Integration System</w:t>
-      </w:r>
-    </w:p>
-    <w:p>
-      <w:pPr>
-        <w:spacing w:line="360" w:lineRule="auto"/>
-        <w:rPr>
-          <w:rFonts w:ascii="Arial" w:hAnsi="Arial" w:cs="Arial"/>
-          <w:sz w:val="16"/>
-          <w:szCs w:val="16"/>
-        </w:rPr>
-      </w:pPr>
-      <w:r>
-        <w:rPr>
-          <w:rFonts w:ascii="Arial" w:hAnsi="Arial" w:cs="Arial"/>
-          <w:b/>
-          <w:bCs/>
-          <w:sz w:val="16"/>
-          <w:szCs w:val="16"/>
+          <w:rFonts w:ascii="Times New Roman" w:hAnsi="Times New Roman" w:cs="Times New Roman"/>
+          <w:b/>
+          <w:bCs/>
+          <w:sz w:val="20"/>
+          <w:szCs w:val="20"/>
+        </w:rPr>
+      </w:pPr>
+      <w:r>
+        <w:rPr>
+          <w:rFonts w:ascii="Times New Roman" w:hAnsi="Times New Roman" w:cs="Times New Roman"/>
+          <w:b/>
+          <w:bCs/>
+          <w:sz w:val="20"/>
+          <w:szCs w:val="20"/>
+        </w:rPr>
+        <w:t>Client : Bosch Global Software Technologies – Integration System</w:t>
+      </w:r>
+    </w:p>
+    <w:p>
+      <w:pPr>
+        <w:spacing w:line="360" w:lineRule="auto"/>
+        <w:rPr>
+          <w:rFonts w:ascii="Times New Roman" w:hAnsi="Times New Roman" w:cs="Times New Roman"/>
+          <w:sz w:val="20"/>
+          <w:szCs w:val="20"/>
+        </w:rPr>
+      </w:pPr>
+      <w:r>
+        <w:rPr>
+          <w:rFonts w:ascii="Times New Roman" w:hAnsi="Times New Roman" w:cs="Times New Roman"/>
+          <w:b/>
+          <w:bCs/>
+          <w:sz w:val="20"/>
+          <w:szCs w:val="20"/>
         </w:rPr>
         <w:t>Project Description:</w:t>
       </w:r>
       <w:r>
         <w:rPr>
-          <w:rFonts w:ascii="Arial" w:hAnsi="Arial" w:cs="Arial"/>
-          <w:sz w:val="16"/>
-          <w:szCs w:val="16"/>
+          <w:rFonts w:ascii="Times New Roman" w:hAnsi="Times New Roman" w:cs="Times New Roman"/>
+          <w:sz w:val="20"/>
+          <w:szCs w:val="20"/>
         </w:rPr>
         <w:t xml:space="preserve"> Bosch’s Connected Devices Integration System is an </w:t>
       </w:r>
       <w:r>
         <w:rPr>
-          <w:rFonts w:ascii="Arial" w:hAnsi="Arial" w:cs="Arial"/>
-          <w:b/>
-          <w:bCs/>
-          <w:sz w:val="16"/>
-          <w:szCs w:val="16"/>
+          <w:rFonts w:ascii="Times New Roman" w:hAnsi="Times New Roman" w:cs="Times New Roman"/>
+          <w:b/>
+          <w:bCs/>
+          <w:sz w:val="20"/>
+          <w:szCs w:val="20"/>
         </w:rPr>
         <w:t>IoT-based platform</w:t>
       </w:r>
       <w:r>
         <w:rPr>
-          <w:rFonts w:ascii="Arial" w:hAnsi="Arial" w:cs="Arial"/>
-          <w:sz w:val="16"/>
-          <w:szCs w:val="16"/>
+          <w:rFonts w:ascii="Times New Roman" w:hAnsi="Times New Roman" w:cs="Times New Roman"/>
+          <w:sz w:val="20"/>
+          <w:szCs w:val="20"/>
         </w:rPr>
         <w:t xml:space="preserve"> that enables real-time monitoring, control, and analytics for automotive and industrial devices. The system collects sensor data from embedded devices, processes it through cloud-based services, and provides actionable insights </w:t>
       </w:r>
       <w:r>
         <w:rPr>
-          <w:rFonts w:ascii="Arial" w:hAnsi="Arial" w:cs="Arial"/>
-          <w:sz w:val="16"/>
-          <w:szCs w:val="16"/>
+          <w:rFonts w:ascii="Times New Roman" w:hAnsi="Times New Roman" w:cs="Times New Roman"/>
+          <w:sz w:val="20"/>
+          <w:szCs w:val="20"/>
         </w:rPr>
         <w:t>for predictive maintenance and automation.</w:t>
       </w:r>
@@ -1064,26 +978,26 @@
         </w:numPr>
         <w:spacing w:line="360" w:lineRule="auto"/>
         <w:rPr>
-          <w:rFonts w:ascii="Arial" w:hAnsi="Arial" w:cs="Arial"/>
-          <w:sz w:val="16"/>
-          <w:szCs w:val="16"/>
-        </w:rPr>
-      </w:pPr>
-      <w:r>
-        <w:rPr>
-          <w:rFonts w:ascii="Arial" w:hAnsi="Arial" w:cs="Arial"/>
-          <w:b/>
-          <w:bCs/>
-          <w:sz w:val="16"/>
-          <w:szCs w:val="16"/>
+          <w:rFonts w:ascii="Times New Roman" w:hAnsi="Times New Roman" w:cs="Times New Roman"/>
+          <w:sz w:val="20"/>
+          <w:szCs w:val="20"/>
+        </w:rPr>
+      </w:pPr>
+      <w:r>
+        <w:rPr>
+          <w:rFonts w:ascii="Times New Roman" w:hAnsi="Times New Roman" w:cs="Times New Roman"/>
+          <w:b/>
+          <w:bCs/>
+          <w:sz w:val="20"/>
+          <w:szCs w:val="20"/>
         </w:rPr>
         <w:t>Developed and maintained backend microservices</w:t>
       </w:r>
       <w:r>
         <w:rPr>
-          <w:rFonts w:ascii="Arial" w:hAnsi="Arial" w:cs="Arial"/>
-          <w:sz w:val="16"/>
-          <w:szCs w:val="16"/>
+          <w:rFonts w:ascii="Times New Roman" w:hAnsi="Times New Roman" w:cs="Times New Roman"/>
+          <w:sz w:val="20"/>
+          <w:szCs w:val="20"/>
         </w:rPr>
         <w:t xml:space="preserve"> for Bosch Global Software Technologies, handling real-time IoT data from connected devices, ensuring cloud integration and system scalability.</w:t>
       </w:r>
@@ -1096,44 +1010,44 @@
         </w:numPr>
         <w:spacing w:line="360" w:lineRule="auto"/>
         <w:rPr>
-          <w:rFonts w:ascii="Arial" w:hAnsi="Arial" w:cs="Arial"/>
-          <w:sz w:val="16"/>
-          <w:szCs w:val="16"/>
-        </w:rPr>
-      </w:pPr>
-      <w:r>
-        <w:rPr>
-          <w:rFonts w:ascii="Arial" w:hAnsi="Arial" w:cs="Arial"/>
-          <w:b/>
-          <w:bCs/>
-          <w:sz w:val="16"/>
-          <w:szCs w:val="16"/>
+          <w:rFonts w:ascii="Times New Roman" w:hAnsi="Times New Roman" w:cs="Times New Roman"/>
+          <w:sz w:val="20"/>
+          <w:szCs w:val="20"/>
+        </w:rPr>
+      </w:pPr>
+      <w:r>
+        <w:rPr>
+          <w:rFonts w:ascii="Times New Roman" w:hAnsi="Times New Roman" w:cs="Times New Roman"/>
+          <w:b/>
+          <w:bCs/>
+          <w:sz w:val="20"/>
+          <w:szCs w:val="20"/>
         </w:rPr>
         <w:t>Integrated AWS services</w:t>
       </w:r>
       <w:r>
         <w:rPr>
-          <w:rFonts w:ascii="Arial" w:hAnsi="Arial" w:cs="Arial"/>
-          <w:sz w:val="16"/>
-          <w:szCs w:val="16"/>
+          <w:rFonts w:ascii="Times New Roman" w:hAnsi="Times New Roman" w:cs="Times New Roman"/>
+          <w:sz w:val="20"/>
+          <w:szCs w:val="20"/>
         </w:rPr>
         <w:t xml:space="preserve"> like EC2, Lambda, and Step Functions to enable scalable data management, </w:t>
       </w:r>
       <w:r>
         <w:rPr>
-          <w:rFonts w:ascii="Arial" w:hAnsi="Arial" w:cs="Arial"/>
-          <w:b/>
-          <w:bCs/>
-          <w:sz w:val="16"/>
-          <w:szCs w:val="16"/>
+          <w:rFonts w:ascii="Times New Roman" w:hAnsi="Times New Roman" w:cs="Times New Roman"/>
+          <w:b/>
+          <w:bCs/>
+          <w:sz w:val="20"/>
+          <w:szCs w:val="20"/>
         </w:rPr>
         <w:t>optimizing resource usage by 20%</w:t>
       </w:r>
       <w:r>
         <w:rPr>
-          <w:rFonts w:ascii="Arial" w:hAnsi="Arial" w:cs="Arial"/>
-          <w:sz w:val="16"/>
-          <w:szCs w:val="16"/>
+          <w:rFonts w:ascii="Times New Roman" w:hAnsi="Times New Roman" w:cs="Times New Roman"/>
+          <w:sz w:val="20"/>
+          <w:szCs w:val="20"/>
         </w:rPr>
         <w:t>.</w:t>
       </w:r>
@@ -1146,26 +1060,26 @@
         </w:numPr>
         <w:spacing w:line="360" w:lineRule="auto"/>
         <w:rPr>
-          <w:rFonts w:ascii="Arial" w:hAnsi="Arial" w:cs="Arial"/>
-          <w:sz w:val="16"/>
-          <w:szCs w:val="16"/>
-        </w:rPr>
-      </w:pPr>
-      <w:r>
-        <w:rPr>
-          <w:rFonts w:ascii="Arial" w:hAnsi="Arial" w:cs="Arial"/>
-          <w:b/>
-          <w:bCs/>
-          <w:sz w:val="16"/>
-          <w:szCs w:val="16"/>
+          <w:rFonts w:ascii="Times New Roman" w:hAnsi="Times New Roman" w:cs="Times New Roman"/>
+          <w:sz w:val="20"/>
+          <w:szCs w:val="20"/>
+        </w:rPr>
+      </w:pPr>
+      <w:r>
+        <w:rPr>
+          <w:rFonts w:ascii="Times New Roman" w:hAnsi="Times New Roman" w:cs="Times New Roman"/>
+          <w:b/>
+          <w:bCs/>
+          <w:sz w:val="20"/>
+          <w:szCs w:val="20"/>
         </w:rPr>
         <w:t>Led the design and implementation of cloud-based solutions</w:t>
       </w:r>
       <w:r>
         <w:rPr>
-          <w:rFonts w:ascii="Arial" w:hAnsi="Arial" w:cs="Arial"/>
-          <w:sz w:val="16"/>
-          <w:szCs w:val="16"/>
+          <w:rFonts w:ascii="Times New Roman" w:hAnsi="Times New Roman" w:cs="Times New Roman"/>
+          <w:sz w:val="20"/>
+          <w:szCs w:val="20"/>
         </w:rPr>
         <w:t>, improving system responsiveness and ensuring optimized resource utilization to improve performance by 20%.</w:t>
       </w:r>
@@ -1178,26 +1092,26 @@
         </w:numPr>
         <w:spacing w:line="360" w:lineRule="auto"/>
         <w:rPr>
-          <w:rFonts w:ascii="Arial" w:hAnsi="Arial" w:cs="Arial"/>
-          <w:sz w:val="16"/>
-          <w:szCs w:val="16"/>
-        </w:rPr>
-      </w:pPr>
-      <w:r>
-        <w:rPr>
-          <w:rFonts w:ascii="Arial" w:hAnsi="Arial" w:cs="Arial"/>
-          <w:b/>
-          <w:bCs/>
-          <w:sz w:val="16"/>
-          <w:szCs w:val="16"/>
+          <w:rFonts w:ascii="Times New Roman" w:hAnsi="Times New Roman" w:cs="Times New Roman"/>
+          <w:sz w:val="20"/>
+          <w:szCs w:val="20"/>
+        </w:rPr>
+      </w:pPr>
+      <w:r>
+        <w:rPr>
+          <w:rFonts w:ascii="Times New Roman" w:hAnsi="Times New Roman" w:cs="Times New Roman"/>
+          <w:b/>
+          <w:bCs/>
+          <w:sz w:val="20"/>
+          <w:szCs w:val="20"/>
         </w:rPr>
         <w:t>Automated deployment processes using Jenkins and Docker</w:t>
       </w:r>
       <w:r>
         <w:rPr>
-          <w:rFonts w:ascii="Arial" w:hAnsi="Arial" w:cs="Arial"/>
-          <w:sz w:val="16"/>
-          <w:szCs w:val="16"/>
+          <w:rFonts w:ascii="Times New Roman" w:hAnsi="Times New Roman" w:cs="Times New Roman"/>
+          <w:sz w:val="20"/>
+          <w:szCs w:val="20"/>
         </w:rPr>
         <w:t>, significantly reducing manual intervention and improving the CI/CD pipeline.</w:t>
       </w:r>
@@ -1210,16 +1124,16 @@
         </w:numPr>
         <w:spacing w:line="360" w:lineRule="auto"/>
         <w:rPr>
-          <w:rFonts w:ascii="Arial" w:hAnsi="Arial" w:cs="Arial"/>
-          <w:sz w:val="16"/>
-          <w:szCs w:val="16"/>
-        </w:rPr>
-      </w:pPr>
-      <w:r>
-        <w:rPr>
-          <w:rFonts w:ascii="Arial" w:hAnsi="Arial" w:cs="Arial"/>
-          <w:sz w:val="16"/>
-          <w:szCs w:val="16"/>
+          <w:rFonts w:ascii="Times New Roman" w:hAnsi="Times New Roman" w:cs="Times New Roman"/>
+          <w:sz w:val="20"/>
+          <w:szCs w:val="20"/>
+        </w:rPr>
+      </w:pPr>
+      <w:r>
+        <w:rPr>
+          <w:rFonts w:ascii="Times New Roman" w:hAnsi="Times New Roman" w:cs="Times New Roman"/>
+          <w:sz w:val="20"/>
+          <w:szCs w:val="20"/>
         </w:rPr>
         <w:t>Worked with cross-functional teams to troubleshoot and resolve system issues, ensuring smooth integration with Bosch’s infrastructure and optimizing data flow.</w:t>
       </w:r>
@@ -1232,26 +1146,26 @@
         </w:numPr>
         <w:spacing w:line="360" w:lineRule="auto"/>
         <w:rPr>
-          <w:rFonts w:ascii="Arial" w:hAnsi="Arial" w:cs="Arial"/>
-          <w:sz w:val="16"/>
-          <w:szCs w:val="16"/>
-        </w:rPr>
-      </w:pPr>
-      <w:r>
-        <w:rPr>
-          <w:rFonts w:ascii="Arial" w:hAnsi="Arial" w:cs="Arial"/>
-          <w:b/>
-          <w:bCs/>
-          <w:sz w:val="16"/>
-          <w:szCs w:val="16"/>
+          <w:rFonts w:ascii="Times New Roman" w:hAnsi="Times New Roman" w:cs="Times New Roman"/>
+          <w:sz w:val="20"/>
+          <w:szCs w:val="20"/>
+        </w:rPr>
+      </w:pPr>
+      <w:r>
+        <w:rPr>
+          <w:rFonts w:ascii="Times New Roman" w:hAnsi="Times New Roman" w:cs="Times New Roman"/>
+          <w:b/>
+          <w:bCs/>
+          <w:sz w:val="20"/>
+          <w:szCs w:val="20"/>
         </w:rPr>
         <w:t>Developed real-time microservices using Java, Spring Boot, and REST APIs</w:t>
       </w:r>
       <w:r>
         <w:rPr>
-          <w:rFonts w:ascii="Arial" w:hAnsi="Arial" w:cs="Arial"/>
-          <w:sz w:val="16"/>
-          <w:szCs w:val="16"/>
+          <w:rFonts w:ascii="Times New Roman" w:hAnsi="Times New Roman" w:cs="Times New Roman"/>
+          <w:sz w:val="20"/>
+          <w:szCs w:val="20"/>
         </w:rPr>
         <w:t>, handling data from multiple connected devices.</w:t>
       </w:r>
@@ -1264,36 +1178,36 @@
         </w:numPr>
         <w:spacing w:line="360" w:lineRule="auto"/>
         <w:rPr>
-          <w:rFonts w:ascii="Arial" w:hAnsi="Arial" w:cs="Arial"/>
-          <w:sz w:val="16"/>
-          <w:szCs w:val="16"/>
-        </w:rPr>
-      </w:pPr>
-      <w:r>
-        <w:rPr>
-          <w:rFonts w:ascii="Arial" w:hAnsi="Arial" w:cs="Arial"/>
-          <w:b/>
-          <w:bCs/>
-          <w:sz w:val="16"/>
-          <w:szCs w:val="16"/>
+          <w:rFonts w:ascii="Times New Roman" w:hAnsi="Times New Roman" w:cs="Times New Roman"/>
+          <w:sz w:val="20"/>
+          <w:szCs w:val="20"/>
+        </w:rPr>
+      </w:pPr>
+      <w:r>
+        <w:rPr>
+          <w:rFonts w:ascii="Times New Roman" w:hAnsi="Times New Roman" w:cs="Times New Roman"/>
+          <w:b/>
+          <w:bCs/>
+          <w:sz w:val="20"/>
+          <w:szCs w:val="20"/>
         </w:rPr>
         <w:t>Created intuitive front-end UI components using React</w:t>
       </w:r>
       <w:r>
         <w:rPr>
-          <w:rFonts w:ascii="Arial" w:hAnsi="Arial" w:cs="Arial"/>
-          <w:b/>
-          <w:bCs/>
-          <w:sz w:val="16"/>
-          <w:szCs w:val="16"/>
+          <w:rFonts w:ascii="Times New Roman" w:hAnsi="Times New Roman" w:cs="Times New Roman"/>
+          <w:b/>
+          <w:bCs/>
+          <w:sz w:val="20"/>
+          <w:szCs w:val="20"/>
         </w:rPr>
         <w:t xml:space="preserve"> &amp; Angular</w:t>
       </w:r>
       <w:r>
         <w:rPr>
-          <w:rFonts w:ascii="Arial" w:hAnsi="Arial" w:cs="Arial"/>
-          <w:sz w:val="16"/>
-          <w:szCs w:val="16"/>
+          <w:rFonts w:ascii="Times New Roman" w:hAnsi="Times New Roman" w:cs="Times New Roman"/>
+          <w:sz w:val="20"/>
+          <w:szCs w:val="20"/>
         </w:rPr>
         <w:t>, improving the user experience and facilitating smoother interactions with backend microservices.</w:t>
       </w:r>
@@ -1306,26 +1220,26 @@
         </w:numPr>
         <w:spacing w:line="360" w:lineRule="auto"/>
         <w:rPr>
-          <w:rFonts w:ascii="Arial" w:hAnsi="Arial" w:cs="Arial"/>
-          <w:sz w:val="16"/>
-          <w:szCs w:val="16"/>
-        </w:rPr>
-      </w:pPr>
-      <w:r>
-        <w:rPr>
-          <w:rFonts w:ascii="Arial" w:hAnsi="Arial" w:cs="Arial"/>
-          <w:b/>
-          <w:bCs/>
-          <w:sz w:val="16"/>
-          <w:szCs w:val="16"/>
+          <w:rFonts w:ascii="Times New Roman" w:hAnsi="Times New Roman" w:cs="Times New Roman"/>
+          <w:sz w:val="20"/>
+          <w:szCs w:val="20"/>
+        </w:rPr>
+      </w:pPr>
+      <w:r>
+        <w:rPr>
+          <w:rFonts w:ascii="Times New Roman" w:hAnsi="Times New Roman" w:cs="Times New Roman"/>
+          <w:b/>
+          <w:bCs/>
+          <w:sz w:val="20"/>
+          <w:szCs w:val="20"/>
         </w:rPr>
         <w:t>Contributed to the system architecture design</w:t>
       </w:r>
       <w:r>
         <w:rPr>
-          <w:rFonts w:ascii="Arial" w:hAnsi="Arial" w:cs="Arial"/>
-          <w:sz w:val="16"/>
-          <w:szCs w:val="16"/>
+          <w:rFonts w:ascii="Times New Roman" w:hAnsi="Times New Roman" w:cs="Times New Roman"/>
+          <w:sz w:val="20"/>
+          <w:szCs w:val="20"/>
         </w:rPr>
         <w:t>, ensuring reliable data storage and monitoring systems to enhance system robustness.</w:t>
       </w:r>
@@ -1334,16 +1248,16 @@
       <w:pPr>
         <w:spacing w:line="360" w:lineRule="auto"/>
         <w:rPr>
-          <w:rFonts w:ascii="Arial" w:hAnsi="Arial" w:cs="Arial"/>
-          <w:sz w:val="16"/>
-          <w:szCs w:val="16"/>
-        </w:rPr>
-      </w:pPr>
-      <w:r>
-        <w:rPr>
-          <w:rFonts w:ascii="Arial" w:hAnsi="Arial" w:cs="Arial"/>
-          <w:sz w:val="16"/>
-          <w:szCs w:val="16"/>
+          <w:rFonts w:ascii="Times New Roman" w:hAnsi="Times New Roman" w:cs="Times New Roman"/>
+          <w:sz w:val="20"/>
+          <w:szCs w:val="20"/>
+        </w:rPr>
+      </w:pPr>
+      <w:r>
+        <w:rPr>
+          <w:rFonts w:ascii="Times New Roman" w:hAnsi="Times New Roman" w:cs="Times New Roman"/>
+          <w:sz w:val="20"/>
+          <w:szCs w:val="20"/>
         </w:rPr>
         <w:pict w14:anchorId="6DED1D23">
           <v:rect id="_x0000_i1028" style="width:0;height:1.5pt" o:hralign="center" o:hrstd="t" o:hr="t" fillcolor="#a0a0a0" stroked="f"/>
@@ -1354,32 +1268,71 @@
       <w:pPr>
         <w:spacing w:line="360" w:lineRule="auto"/>
         <w:rPr>
-          <w:rFonts w:ascii="Arial" w:hAnsi="Arial" w:cs="Arial"/>
-          <w:b/>
-          <w:bCs/>
-          <w:sz w:val="16"/>
-          <w:szCs w:val="16"/>
+          <w:rFonts w:ascii="Times New Roman" w:hAnsi="Times New Roman" w:cs="Times New Roman"/>
+          <w:b/>
+          <w:bCs/>
+          <w:sz w:val="20"/>
+          <w:szCs w:val="20"/>
           <w:u w:val="single"/>
         </w:rPr>
       </w:pPr>
-      <w:r>
-        <w:rPr>
-          <w:rFonts w:ascii="Arial" w:hAnsi="Arial" w:cs="Arial"/>
-          <w:b/>
-          <w:bCs/>
-          <w:sz w:val="16"/>
-          <w:szCs w:val="16"/>
+    </w:p>
+    <w:p>
+      <w:pPr>
+        <w:spacing w:line="360" w:lineRule="auto"/>
+        <w:rPr>
+          <w:rFonts w:ascii="Times New Roman" w:hAnsi="Times New Roman" w:cs="Times New Roman"/>
+          <w:b/>
+          <w:bCs/>
+          <w:sz w:val="20"/>
+          <w:szCs w:val="20"/>
           <w:u w:val="single"/>
         </w:rPr>
+      </w:pPr>
+    </w:p>
+    <w:p>
+      <w:pPr>
+        <w:spacing w:line="360" w:lineRule="auto"/>
+        <w:rPr>
+          <w:rFonts w:ascii="Times New Roman" w:hAnsi="Times New Roman" w:cs="Times New Roman"/>
+          <w:b/>
+          <w:bCs/>
+          <w:sz w:val="20"/>
+          <w:szCs w:val="20"/>
+          <w:u w:val="single"/>
+        </w:rPr>
+      </w:pPr>
+    </w:p>
+    <w:p>
+      <w:pPr>
+        <w:spacing w:line="360" w:lineRule="auto"/>
+        <w:rPr>
+          <w:rFonts w:ascii="Times New Roman" w:hAnsi="Times New Roman" w:cs="Times New Roman"/>
+          <w:b/>
+          <w:bCs/>
+          <w:sz w:val="20"/>
+          <w:szCs w:val="20"/>
+          <w:u w:val="single"/>
+        </w:rPr>
+      </w:pPr>
+      <w:r>
+        <w:rPr>
+          <w:rFonts w:ascii="Times New Roman" w:hAnsi="Times New Roman" w:cs="Times New Roman"/>
+          <w:b/>
+          <w:bCs/>
+          <w:sz w:val="20"/>
+          <w:szCs w:val="20"/>
+          <w:u w:val="single"/>
+        </w:rPr>
         <w:t>Technical Skills</w:t>
       </w:r>
       <w:r>
         <w:rPr>
-          <w:rFonts w:ascii="Arial" w:hAnsi="Arial" w:cs="Arial"/>
-          <w:b/>
-          <w:bCs/>
-          <w:sz w:val="16"/>
-          <w:szCs w:val="16"/>
+          <w:rFonts w:ascii="Times New Roman" w:hAnsi="Times New Roman" w:cs="Times New Roman"/>
+          <w:b/>
+          <w:bCs/>
+          <w:sz w:val="20"/>
+          <w:szCs w:val="20"/>
           <w:u w:val="single"/>
         </w:rPr>
         <w:t>:</w:t>
@@ -1393,26 +1346,26 @@
         </w:numPr>
         <w:spacing w:line="360" w:lineRule="auto"/>
         <w:rPr>
-          <w:rFonts w:ascii="Arial" w:hAnsi="Arial" w:cs="Arial"/>
-          <w:sz w:val="16"/>
-          <w:szCs w:val="16"/>
-        </w:rPr>
-      </w:pPr>
-      <w:r>
-        <w:rPr>
-          <w:rFonts w:ascii="Arial" w:hAnsi="Arial" w:cs="Arial"/>
-          <w:b/>
-          <w:bCs/>
-          <w:sz w:val="16"/>
-          <w:szCs w:val="16"/>
+          <w:rFonts w:ascii="Times New Roman" w:hAnsi="Times New Roman" w:cs="Times New Roman"/>
+          <w:sz w:val="20"/>
+          <w:szCs w:val="20"/>
+        </w:rPr>
+      </w:pPr>
+      <w:r>
+        <w:rPr>
+          <w:rFonts w:ascii="Times New Roman" w:hAnsi="Times New Roman" w:cs="Times New Roman"/>
+          <w:b/>
+          <w:bCs/>
+          <w:sz w:val="20"/>
+          <w:szCs w:val="20"/>
         </w:rPr>
         <w:t>Programming Languages:</w:t>
       </w:r>
       <w:r>
         <w:rPr>
-          <w:rFonts w:ascii="Arial" w:hAnsi="Arial" w:cs="Arial"/>
-          <w:sz w:val="16"/>
-          <w:szCs w:val="16"/>
+          <w:rFonts w:ascii="Times New Roman" w:hAnsi="Times New Roman" w:cs="Times New Roman"/>
+          <w:sz w:val="20"/>
+          <w:szCs w:val="20"/>
         </w:rPr>
         <w:t xml:space="preserve"> Java, Python, JavaScript</w:t>
       </w:r>
@@ -1425,26 +1378,26 @@
         </w:numPr>
         <w:spacing w:line="360" w:lineRule="auto"/>
         <w:rPr>
-          <w:rFonts w:ascii="Arial" w:hAnsi="Arial" w:cs="Arial"/>
-          <w:sz w:val="16"/>
-          <w:szCs w:val="16"/>
-        </w:rPr>
-      </w:pPr>
-      <w:r>
-        <w:rPr>
-          <w:rFonts w:ascii="Arial" w:hAnsi="Arial" w:cs="Arial"/>
-          <w:b/>
-          <w:bCs/>
-          <w:sz w:val="16"/>
-          <w:szCs w:val="16"/>
+          <w:rFonts w:ascii="Times New Roman" w:hAnsi="Times New Roman" w:cs="Times New Roman"/>
+          <w:sz w:val="20"/>
+          <w:szCs w:val="20"/>
+        </w:rPr>
+      </w:pPr>
+      <w:r>
+        <w:rPr>
+          <w:rFonts w:ascii="Times New Roman" w:hAnsi="Times New Roman" w:cs="Times New Roman"/>
+          <w:b/>
+          <w:bCs/>
+          <w:sz w:val="20"/>
+          <w:szCs w:val="20"/>
         </w:rPr>
         <w:t>Backend:</w:t>
       </w:r>
       <w:r>
         <w:rPr>
-          <w:rFonts w:ascii="Arial" w:hAnsi="Arial" w:cs="Arial"/>
-          <w:sz w:val="16"/>
-          <w:szCs w:val="16"/>
+          <w:rFonts w:ascii="Times New Roman" w:hAnsi="Times New Roman" w:cs="Times New Roman"/>
+          <w:sz w:val="20"/>
+          <w:szCs w:val="20"/>
         </w:rPr>
         <w:t xml:space="preserve"> Spring Boot, Spring MVC, Hibernate, Microservices, REST APIs</w:t>
       </w:r>
@@ -1457,26 +1410,26 @@
         </w:numPr>
         <w:spacing w:line="360" w:lineRule="auto"/>
         <w:rPr>
-          <w:rFonts w:ascii="Arial" w:hAnsi="Arial" w:cs="Arial"/>
-          <w:sz w:val="16"/>
-          <w:szCs w:val="16"/>
-        </w:rPr>
-      </w:pPr>
-      <w:r>
-        <w:rPr>
-          <w:rFonts w:ascii="Arial" w:hAnsi="Arial" w:cs="Arial"/>
-          <w:b/>
-          <w:bCs/>
-          <w:sz w:val="16"/>
-          <w:szCs w:val="16"/>
+          <w:rFonts w:ascii="Times New Roman" w:hAnsi="Times New Roman" w:cs="Times New Roman"/>
+          <w:sz w:val="20"/>
+          <w:szCs w:val="20"/>
+        </w:rPr>
+      </w:pPr>
+      <w:r>
+        <w:rPr>
+          <w:rFonts w:ascii="Times New Roman" w:hAnsi="Times New Roman" w:cs="Times New Roman"/>
+          <w:b/>
+          <w:bCs/>
+          <w:sz w:val="20"/>
+          <w:szCs w:val="20"/>
         </w:rPr>
         <w:t>Frontend:</w:t>
       </w:r>
       <w:r>
         <w:rPr>
-          <w:rFonts w:ascii="Arial" w:hAnsi="Arial" w:cs="Arial"/>
-          <w:sz w:val="16"/>
-          <w:szCs w:val="16"/>
+          <w:rFonts w:ascii="Times New Roman" w:hAnsi="Times New Roman" w:cs="Times New Roman"/>
+          <w:sz w:val="20"/>
+          <w:szCs w:val="20"/>
         </w:rPr>
         <w:t xml:space="preserve"> React.js, Angular, TypeScript, HTML, CSS</w:t>
       </w:r>
@@ -1489,34 +1442,34 @@
         </w:numPr>
         <w:spacing w:line="360" w:lineRule="auto"/>
         <w:rPr>
-          <w:rFonts w:ascii="Arial" w:hAnsi="Arial" w:cs="Arial"/>
-          <w:sz w:val="16"/>
-          <w:szCs w:val="16"/>
-        </w:rPr>
-      </w:pPr>
-      <w:r>
-        <w:rPr>
-          <w:rFonts w:ascii="Arial" w:hAnsi="Arial" w:cs="Arial"/>
-          <w:b/>
-          <w:bCs/>
-          <w:sz w:val="16"/>
-          <w:szCs w:val="16"/>
+          <w:rFonts w:ascii="Times New Roman" w:hAnsi="Times New Roman" w:cs="Times New Roman"/>
+          <w:sz w:val="20"/>
+          <w:szCs w:val="20"/>
+        </w:rPr>
+      </w:pPr>
+      <w:r>
+        <w:rPr>
+          <w:rFonts w:ascii="Times New Roman" w:hAnsi="Times New Roman" w:cs="Times New Roman"/>
+          <w:b/>
+          <w:bCs/>
+          <w:sz w:val="20"/>
+          <w:szCs w:val="20"/>
         </w:rPr>
         <w:t>Cloud &amp; DevOps:</w:t>
       </w:r>
       <w:r>
         <w:rPr>
-          <w:rFonts w:ascii="Arial" w:hAnsi="Arial" w:cs="Arial"/>
-          <w:sz w:val="16"/>
-          <w:szCs w:val="16"/>
+          <w:rFonts w:ascii="Times New Roman" w:hAnsi="Times New Roman" w:cs="Times New Roman"/>
+          <w:sz w:val="20"/>
+          <w:szCs w:val="20"/>
         </w:rPr>
         <w:t xml:space="preserve"> AWS (EC2, S3, Lambda, Step Functions, API Gateway), GCP (Basic), Docker, Kubernetes, Jenkins, CI/CD</w:t>
       </w:r>
       <w:r>
         <w:rPr>
-          <w:rFonts w:ascii="Arial" w:hAnsi="Arial" w:cs="Arial"/>
-          <w:sz w:val="16"/>
-          <w:szCs w:val="16"/>
+          <w:rFonts w:ascii="Times New Roman" w:hAnsi="Times New Roman" w:cs="Times New Roman"/>
+          <w:sz w:val="20"/>
+          <w:szCs w:val="20"/>
         </w:rPr>
         <w:t>, GCP</w:t>
       </w:r>
@@ -1529,26 +1482,26 @@
         </w:numPr>
         <w:spacing w:line="360" w:lineRule="auto"/>
         <w:rPr>
-          <w:rFonts w:ascii="Arial" w:hAnsi="Arial" w:cs="Arial"/>
-          <w:sz w:val="16"/>
-          <w:szCs w:val="16"/>
-        </w:rPr>
-      </w:pPr>
-      <w:r>
-        <w:rPr>
-          <w:rFonts w:ascii="Arial" w:hAnsi="Arial" w:cs="Arial"/>
-          <w:b/>
-          <w:bCs/>
-          <w:sz w:val="16"/>
-          <w:szCs w:val="16"/>
+          <w:rFonts w:ascii="Times New Roman" w:hAnsi="Times New Roman" w:cs="Times New Roman"/>
+          <w:sz w:val="20"/>
+          <w:szCs w:val="20"/>
+        </w:rPr>
+      </w:pPr>
+      <w:r>
+        <w:rPr>
+          <w:rFonts w:ascii="Times New Roman" w:hAnsi="Times New Roman" w:cs="Times New Roman"/>
+          <w:b/>
+          <w:bCs/>
+          <w:sz w:val="20"/>
+          <w:szCs w:val="20"/>
         </w:rPr>
         <w:t>Databases:</w:t>
       </w:r>
       <w:r>
         <w:rPr>
-          <w:rFonts w:ascii="Arial" w:hAnsi="Arial" w:cs="Arial"/>
-          <w:sz w:val="16"/>
-          <w:szCs w:val="16"/>
+          <w:rFonts w:ascii="Times New Roman" w:hAnsi="Times New Roman" w:cs="Times New Roman"/>
+          <w:sz w:val="20"/>
+          <w:szCs w:val="20"/>
         </w:rPr>
         <w:t xml:space="preserve"> SQL, MySQL, MongoDB (Basic)</w:t>
       </w:r>
@@ -1561,26 +1514,26 @@
         </w:numPr>
         <w:spacing w:line="360" w:lineRule="auto"/>
         <w:rPr>
-          <w:rFonts w:ascii="Arial" w:hAnsi="Arial" w:cs="Arial"/>
-          <w:sz w:val="16"/>
-          <w:szCs w:val="16"/>
-        </w:rPr>
-      </w:pPr>
-      <w:r>
-        <w:rPr>
-          <w:rFonts w:ascii="Arial" w:hAnsi="Arial" w:cs="Arial"/>
-          <w:b/>
-          <w:bCs/>
-          <w:sz w:val="16"/>
-          <w:szCs w:val="16"/>
+          <w:rFonts w:ascii="Times New Roman" w:hAnsi="Times New Roman" w:cs="Times New Roman"/>
+          <w:sz w:val="20"/>
+          <w:szCs w:val="20"/>
+        </w:rPr>
+      </w:pPr>
+      <w:r>
+        <w:rPr>
+          <w:rFonts w:ascii="Times New Roman" w:hAnsi="Times New Roman" w:cs="Times New Roman"/>
+          <w:b/>
+          <w:bCs/>
+          <w:sz w:val="20"/>
+          <w:szCs w:val="20"/>
         </w:rPr>
         <w:t>Tools &amp; Version Control:</w:t>
       </w:r>
       <w:r>
         <w:rPr>
-          <w:rFonts w:ascii="Arial" w:hAnsi="Arial" w:cs="Arial"/>
-          <w:sz w:val="16"/>
-          <w:szCs w:val="16"/>
+          <w:rFonts w:ascii="Times New Roman" w:hAnsi="Times New Roman" w:cs="Times New Roman"/>
+          <w:sz w:val="20"/>
+          <w:szCs w:val="20"/>
         </w:rPr>
         <w:t xml:space="preserve"> Git/GitLab, Jira, Postman</w:t>
       </w:r>
@@ -1593,26 +1546,26 @@
         </w:numPr>
         <w:spacing w:line="360" w:lineRule="auto"/>
         <w:rPr>
-          <w:rFonts w:ascii="Arial" w:hAnsi="Arial" w:cs="Arial"/>
-          <w:sz w:val="16"/>
-          <w:szCs w:val="16"/>
-        </w:rPr>
-      </w:pPr>
-      <w:r>
-        <w:rPr>
-          <w:rFonts w:ascii="Arial" w:hAnsi="Arial" w:cs="Arial"/>
-          <w:b/>
-          <w:bCs/>
-          <w:sz w:val="16"/>
-          <w:szCs w:val="16"/>
+          <w:rFonts w:ascii="Times New Roman" w:hAnsi="Times New Roman" w:cs="Times New Roman"/>
+          <w:sz w:val="20"/>
+          <w:szCs w:val="20"/>
+        </w:rPr>
+      </w:pPr>
+      <w:r>
+        <w:rPr>
+          <w:rFonts w:ascii="Times New Roman" w:hAnsi="Times New Roman" w:cs="Times New Roman"/>
+          <w:b/>
+          <w:bCs/>
+          <w:sz w:val="20"/>
+          <w:szCs w:val="20"/>
         </w:rPr>
         <w:t>Testing &amp; Debugging:</w:t>
       </w:r>
       <w:r>
         <w:rPr>
-          <w:rFonts w:ascii="Arial" w:hAnsi="Arial" w:cs="Arial"/>
-          <w:sz w:val="16"/>
-          <w:szCs w:val="16"/>
+          <w:rFonts w:ascii="Times New Roman" w:hAnsi="Times New Roman" w:cs="Times New Roman"/>
+          <w:sz w:val="20"/>
+          <w:szCs w:val="20"/>
         </w:rPr>
         <w:t xml:space="preserve"> JUnit, Selenium</w:t>
       </w:r>
@@ -1625,26 +1578,26 @@
         </w:numPr>
         <w:spacing w:line="360" w:lineRule="auto"/>
         <w:rPr>
-          <w:rFonts w:ascii="Arial" w:hAnsi="Arial" w:cs="Arial"/>
-          <w:sz w:val="16"/>
-          <w:szCs w:val="16"/>
-        </w:rPr>
-      </w:pPr>
-      <w:r>
-        <w:rPr>
-          <w:rFonts w:ascii="Arial" w:hAnsi="Arial" w:cs="Arial"/>
-          <w:b/>
-          <w:bCs/>
-          <w:sz w:val="16"/>
-          <w:szCs w:val="16"/>
+          <w:rFonts w:ascii="Times New Roman" w:hAnsi="Times New Roman" w:cs="Times New Roman"/>
+          <w:sz w:val="20"/>
+          <w:szCs w:val="20"/>
+        </w:rPr>
+      </w:pPr>
+      <w:r>
+        <w:rPr>
+          <w:rFonts w:ascii="Times New Roman" w:hAnsi="Times New Roman" w:cs="Times New Roman"/>
+          <w:b/>
+          <w:bCs/>
+          <w:sz w:val="20"/>
+          <w:szCs w:val="20"/>
         </w:rPr>
         <w:t>Software Development:</w:t>
       </w:r>
       <w:r>
         <w:rPr>
-          <w:rFonts w:ascii="Arial" w:hAnsi="Arial" w:cs="Arial"/>
-          <w:sz w:val="16"/>
-          <w:szCs w:val="16"/>
+          <w:rFonts w:ascii="Times New Roman" w:hAnsi="Times New Roman" w:cs="Times New Roman"/>
+          <w:sz w:val="20"/>
+          <w:szCs w:val="20"/>
         </w:rPr>
         <w:t xml:space="preserve"> Agile, TDD, BDD</w:t>
       </w:r>
@@ -1653,16 +1606,16 @@
       <w:pPr>
         <w:spacing w:line="360" w:lineRule="auto"/>
         <w:rPr>
-          <w:rFonts w:ascii="Arial" w:hAnsi="Arial" w:cs="Arial"/>
-          <w:sz w:val="16"/>
-          <w:szCs w:val="16"/>
-        </w:rPr>
-      </w:pPr>
-      <w:r>
-        <w:rPr>
-          <w:rFonts w:ascii="Arial" w:hAnsi="Arial" w:cs="Arial"/>
-          <w:sz w:val="16"/>
-          <w:szCs w:val="16"/>
+          <w:rFonts w:ascii="Times New Roman" w:hAnsi="Times New Roman" w:cs="Times New Roman"/>
+          <w:sz w:val="20"/>
+          <w:szCs w:val="20"/>
+        </w:rPr>
+      </w:pPr>
+      <w:r>
+        <w:rPr>
+          <w:rFonts w:ascii="Times New Roman" w:hAnsi="Times New Roman" w:cs="Times New Roman"/>
+          <w:sz w:val="20"/>
+          <w:szCs w:val="20"/>
         </w:rPr>
         <w:pict w14:anchorId="3C83B4F6">
           <v:rect id="_x0000_i1029" style="width:0;height:1.5pt" o:hralign="center" o:hrstd="t" o:hr="t" fillcolor="#a0a0a0" stroked="f"/>
@@ -1673,21 +1626,21 @@
       <w:pPr>
         <w:spacing w:line="360" w:lineRule="auto"/>
         <w:rPr>
-          <w:rFonts w:ascii="Arial" w:hAnsi="Arial" w:cs="Arial"/>
-          <w:b/>
-          <w:bCs/>
-          <w:sz w:val="16"/>
-          <w:szCs w:val="16"/>
+          <w:rFonts w:ascii="Times New Roman" w:hAnsi="Times New Roman" w:cs="Times New Roman"/>
+          <w:b/>
+          <w:bCs/>
+          <w:sz w:val="20"/>
+          <w:szCs w:val="20"/>
           <w:u w:val="single"/>
         </w:rPr>
       </w:pPr>
       <w:r>
         <w:rPr>
-          <w:rFonts w:ascii="Arial" w:hAnsi="Arial" w:cs="Arial"/>
-          <w:b/>
-          <w:bCs/>
-          <w:sz w:val="16"/>
-          <w:szCs w:val="16"/>
+          <w:rFonts w:ascii="Times New Roman" w:hAnsi="Times New Roman" w:cs="Times New Roman"/>
+          <w:b/>
+          <w:bCs/>
+          <w:sz w:val="20"/>
+          <w:szCs w:val="20"/>
           <w:u w:val="single"/>
         </w:rPr>
         <w:t>Education:</w:t>
@@ -1697,96 +1650,54 @@
       <w:pPr>
         <w:spacing w:line="360" w:lineRule="auto"/>
         <w:rPr>
-          <w:rFonts w:ascii="Arial" w:hAnsi="Arial" w:cs="Arial"/>
-          <w:sz w:val="16"/>
-          <w:szCs w:val="16"/>
-        </w:rPr>
-      </w:pPr>
-      <w:r>
-        <w:rPr>
-          <w:rFonts w:ascii="Arial" w:hAnsi="Arial" w:cs="Arial"/>
-          <w:b/>
-          <w:bCs/>
-          <w:sz w:val="20"/>
-          <w:szCs w:val="20"/>
-        </w:rPr>
-        <w:t>Narasaraopet Institute of Technology, Narasaraopet</w:t>
-      </w:r>
-      <w:r>
-        <w:rPr>
-          <w:rFonts w:ascii="Arial" w:hAnsi="Arial" w:cs="Arial"/>
-          <w:b/>
-          <w:bCs/>
-          <w:sz w:val="20"/>
-          <w:szCs w:val="20"/>
-        </w:rPr>
-        <w:t xml:space="preserve">                                  </w:t>
-      </w:r>
-      <w:r>
-        <w:rPr>
-          <w:rFonts w:ascii="Arial" w:hAnsi="Arial" w:cs="Arial"/>
-          <w:sz w:val="16"/>
-          <w:szCs w:val="16"/>
+          <w:rFonts w:ascii="Times New Roman" w:hAnsi="Times New Roman" w:cs="Times New Roman"/>
+          <w:sz w:val="20"/>
+          <w:szCs w:val="20"/>
+        </w:rPr>
+      </w:pPr>
+      <w:r>
+        <w:rPr>
+          <w:rFonts w:ascii="Times New Roman" w:hAnsi="Times New Roman" w:cs="Times New Roman"/>
+          <w:b/>
+          <w:bCs/>
+          <w:sz w:val="20"/>
+          <w:szCs w:val="20"/>
+        </w:rPr>
+        <w:t xml:space="preserve">Narasaraopet Institute of Technology, Narasaraopet                                  </w:t>
+      </w:r>
+      <w:r>
+        <w:rPr>
+          <w:rFonts w:ascii="Times New Roman" w:hAnsi="Times New Roman" w:cs="Times New Roman"/>
+          <w:sz w:val="20"/>
+          <w:szCs w:val="20"/>
         </w:rPr>
         <w:br/>
       </w:r>
-      <w:proofErr w:type="spellStart"/>
-      <w:r>
-        <w:rPr>
-          <w:rFonts w:ascii="Arial" w:hAnsi="Arial" w:cs="Arial"/>
+      <w:r>
+        <w:rPr>
+          <w:rFonts w:ascii="Times New Roman" w:hAnsi="Times New Roman" w:cs="Times New Roman"/>
           <w:i/>
           <w:iCs/>
-          <w:sz w:val="16"/>
-          <w:szCs w:val="16"/>
-        </w:rPr>
-        <w:t>B.Tech</w:t>
-      </w:r>
-      <w:proofErr w:type="spellEnd"/>
-      <w:r>
-        <w:rPr>
-          <w:rFonts w:ascii="Arial" w:hAnsi="Arial" w:cs="Arial"/>
-          <w:i/>
-          <w:iCs/>
-          <w:sz w:val="16"/>
-          <w:szCs w:val="16"/>
-        </w:rPr>
-        <w:t xml:space="preserve"> in Electronics &amp; Communication Engineering</w:t>
-      </w:r>
-      <w:r>
-        <w:rPr>
-          <w:rFonts w:ascii="Arial" w:hAnsi="Arial" w:cs="Arial"/>
-          <w:i/>
-          <w:iCs/>
-          <w:sz w:val="16"/>
-          <w:szCs w:val="16"/>
-        </w:rPr>
-        <w:t xml:space="preserve">                                                                                   </w:t>
-      </w:r>
-      <w:r>
-        <w:rPr>
-          <w:rFonts w:ascii="Arial" w:hAnsi="Arial" w:cs="Arial"/>
-          <w:i/>
-          <w:iCs/>
-          <w:sz w:val="16"/>
-          <w:szCs w:val="16"/>
-        </w:rPr>
-        <w:t>July 2016 – October 2020</w:t>
-      </w:r>
-    </w:p>
-    <w:p>
-      <w:pPr>
-        <w:spacing w:line="360" w:lineRule="auto"/>
-        <w:rPr>
-          <w:rFonts w:ascii="Arial" w:hAnsi="Arial" w:cs="Arial"/>
-          <w:sz w:val="16"/>
-          <w:szCs w:val="16"/>
-        </w:rPr>
-      </w:pPr>
-      <w:r>
-        <w:rPr>
-          <w:rFonts w:ascii="Arial" w:hAnsi="Arial" w:cs="Arial"/>
-          <w:sz w:val="16"/>
-          <w:szCs w:val="16"/>
+          <w:sz w:val="20"/>
+          <w:szCs w:val="20"/>
+        </w:rPr>
+        <w:t>B.Tech in Electronics &amp; Communication Engineering                                                           July 2016 – October 2020</w:t>
+      </w:r>
+    </w:p>
+    <w:p>
+      <w:pPr>
+        <w:spacing w:line="360" w:lineRule="auto"/>
+        <w:rPr>
+          <w:rFonts w:ascii="Times New Roman" w:hAnsi="Times New Roman" w:cs="Times New Roman"/>
+          <w:sz w:val="20"/>
+          <w:szCs w:val="20"/>
+        </w:rPr>
+      </w:pPr>
+      <w:r>
+        <w:rPr>
+          <w:rFonts w:ascii="Times New Roman" w:hAnsi="Times New Roman" w:cs="Times New Roman"/>
+          <w:sz w:val="20"/>
+          <w:szCs w:val="20"/>
         </w:rPr>
         <w:pict w14:anchorId="23C214EA">
           <v:rect id="_x0000_i1030" style="width:0;height:1.5pt" o:hralign="center" o:hrstd="t" o:hr="t" fillcolor="#a0a0a0" stroked="f"/>
@@ -1797,35 +1708,24 @@
       <w:pPr>
         <w:spacing w:line="360" w:lineRule="auto"/>
         <w:rPr>
-          <w:rFonts w:ascii="Arial" w:hAnsi="Arial" w:cs="Arial"/>
-          <w:b/>
-          <w:bCs/>
-          <w:sz w:val="16"/>
-          <w:szCs w:val="16"/>
+          <w:rFonts w:ascii="Times New Roman" w:hAnsi="Times New Roman" w:cs="Times New Roman"/>
+          <w:b/>
+          <w:bCs/>
+          <w:sz w:val="20"/>
+          <w:szCs w:val="20"/>
           <w:u w:val="single"/>
         </w:rPr>
       </w:pPr>
       <w:r>
         <w:rPr>
-          <w:rFonts w:ascii="Arial" w:hAnsi="Arial" w:cs="Arial"/>
-          <w:b/>
-          <w:bCs/>
-          <w:sz w:val="16"/>
-          <w:szCs w:val="16"/>
+          <w:rFonts w:ascii="Times New Roman" w:hAnsi="Times New Roman" w:cs="Times New Roman"/>
+          <w:b/>
+          <w:bCs/>
+          <w:sz w:val="20"/>
+          <w:szCs w:val="20"/>
           <w:u w:val="single"/>
         </w:rPr>
-        <w:t>Achievements</w:t>
-      </w:r>
-      <w:r>
-        <w:rPr>
-          <w:rFonts w:ascii="Arial" w:hAnsi="Arial" w:cs="Arial"/>
-          <w:b/>
-          <w:bCs/>
-          <w:sz w:val="16"/>
-          <w:szCs w:val="16"/>
-          <w:u w:val="single"/>
-        </w:rPr>
-        <w:t>:</w:t>
+        <w:t>Achievements:</w:t>
       </w:r>
     </w:p>
     <w:p>
@@ -1836,26 +1736,26 @@
         </w:numPr>
         <w:spacing w:line="360" w:lineRule="auto"/>
         <w:rPr>
-          <w:rFonts w:ascii="Arial" w:hAnsi="Arial" w:cs="Arial"/>
-          <w:sz w:val="16"/>
-          <w:szCs w:val="16"/>
-        </w:rPr>
-      </w:pPr>
-      <w:r>
-        <w:rPr>
-          <w:rFonts w:ascii="Arial" w:hAnsi="Arial" w:cs="Arial"/>
-          <w:b/>
-          <w:bCs/>
-          <w:sz w:val="16"/>
-          <w:szCs w:val="16"/>
+          <w:rFonts w:ascii="Times New Roman" w:hAnsi="Times New Roman" w:cs="Times New Roman"/>
+          <w:sz w:val="20"/>
+          <w:szCs w:val="20"/>
+        </w:rPr>
+      </w:pPr>
+      <w:r>
+        <w:rPr>
+          <w:rFonts w:ascii="Times New Roman" w:hAnsi="Times New Roman" w:cs="Times New Roman"/>
+          <w:b/>
+          <w:bCs/>
+          <w:sz w:val="20"/>
+          <w:szCs w:val="20"/>
         </w:rPr>
         <w:t>Ranked 69th nationally</w:t>
       </w:r>
       <w:r>
         <w:rPr>
-          <w:rFonts w:ascii="Arial" w:hAnsi="Arial" w:cs="Arial"/>
-          <w:sz w:val="16"/>
-          <w:szCs w:val="16"/>
+          <w:rFonts w:ascii="Times New Roman" w:hAnsi="Times New Roman" w:cs="Times New Roman"/>
+          <w:sz w:val="20"/>
+          <w:szCs w:val="20"/>
         </w:rPr>
         <w:t xml:space="preserve"> in the Coding CodeKaze Contest among 25,000+ participants.</w:t>
       </w:r>
@@ -1868,72 +1768,36 @@
         </w:numPr>
         <w:spacing w:line="360" w:lineRule="auto"/>
         <w:rPr>
-          <w:rFonts w:ascii="Arial" w:hAnsi="Arial" w:cs="Arial"/>
-          <w:sz w:val="16"/>
-          <w:szCs w:val="16"/>
-        </w:rPr>
-      </w:pPr>
-      <w:r>
-        <w:rPr>
-          <w:rFonts w:ascii="Arial" w:hAnsi="Arial" w:cs="Arial"/>
-          <w:sz w:val="16"/>
-          <w:szCs w:val="16"/>
+          <w:rFonts w:ascii="Times New Roman" w:hAnsi="Times New Roman" w:cs="Times New Roman"/>
+          <w:sz w:val="20"/>
+          <w:szCs w:val="20"/>
+        </w:rPr>
+      </w:pPr>
+      <w:r>
+        <w:rPr>
+          <w:rFonts w:ascii="Times New Roman" w:hAnsi="Times New Roman" w:cs="Times New Roman"/>
+          <w:sz w:val="20"/>
+          <w:szCs w:val="20"/>
         </w:rPr>
         <w:t xml:space="preserve">Solved </w:t>
       </w:r>
       <w:r>
         <w:rPr>
-          <w:rFonts w:ascii="Arial" w:hAnsi="Arial" w:cs="Arial"/>
-          <w:b/>
-          <w:bCs/>
-          <w:sz w:val="16"/>
-          <w:szCs w:val="16"/>
+          <w:rFonts w:ascii="Times New Roman" w:hAnsi="Times New Roman" w:cs="Times New Roman"/>
+          <w:b/>
+          <w:bCs/>
+          <w:sz w:val="20"/>
+          <w:szCs w:val="20"/>
         </w:rPr>
         <w:t>500+ coding challenges</w:t>
       </w:r>
       <w:r>
         <w:rPr>
-          <w:rFonts w:ascii="Arial" w:hAnsi="Arial" w:cs="Arial"/>
-          <w:sz w:val="16"/>
-          <w:szCs w:val="16"/>
-        </w:rPr>
-        <w:t xml:space="preserve"> on </w:t>
-      </w:r>
-      <w:proofErr w:type="spellStart"/>
-      <w:r>
-        <w:rPr>
-          <w:rFonts w:ascii="Arial" w:hAnsi="Arial" w:cs="Arial"/>
-          <w:sz w:val="16"/>
-          <w:szCs w:val="16"/>
-        </w:rPr>
-        <w:t>LeetCode</w:t>
-      </w:r>
-      <w:proofErr w:type="spellEnd"/>
-      <w:r>
-        <w:rPr>
-          <w:rFonts w:ascii="Arial" w:hAnsi="Arial" w:cs="Arial"/>
-          <w:sz w:val="16"/>
-          <w:szCs w:val="16"/>
-        </w:rPr>
-        <w:t xml:space="preserve">, GeeksforGeeks, and </w:t>
-      </w:r>
-      <w:proofErr w:type="spellStart"/>
-      <w:r>
-        <w:rPr>
-          <w:rFonts w:ascii="Arial" w:hAnsi="Arial" w:cs="Arial"/>
-          <w:sz w:val="16"/>
-          <w:szCs w:val="16"/>
-        </w:rPr>
-        <w:t>HackerRank</w:t>
-      </w:r>
-      <w:proofErr w:type="spellEnd"/>
-      <w:r>
-        <w:rPr>
-          <w:rFonts w:ascii="Arial" w:hAnsi="Arial" w:cs="Arial"/>
-          <w:sz w:val="16"/>
-          <w:szCs w:val="16"/>
-        </w:rPr>
-        <w:t>.</w:t>
+          <w:rFonts w:ascii="Times New Roman" w:hAnsi="Times New Roman" w:cs="Times New Roman"/>
+          <w:sz w:val="20"/>
+          <w:szCs w:val="20"/>
+        </w:rPr>
+        <w:t xml:space="preserve"> on LeetCode, GeeksforGeeks, and HackerRank.</w:t>
       </w:r>
     </w:p>
     <w:p>
@@ -1944,34 +1808,34 @@
         </w:numPr>
         <w:spacing w:line="360" w:lineRule="auto"/>
         <w:rPr>
-          <w:rFonts w:ascii="Arial" w:hAnsi="Arial" w:cs="Arial"/>
-          <w:sz w:val="16"/>
-          <w:szCs w:val="16"/>
-        </w:rPr>
-      </w:pPr>
-      <w:r>
-        <w:rPr>
-          <w:rFonts w:ascii="Arial" w:hAnsi="Arial" w:cs="Arial"/>
-          <w:sz w:val="16"/>
-          <w:szCs w:val="16"/>
+          <w:rFonts w:ascii="Times New Roman" w:hAnsi="Times New Roman" w:cs="Times New Roman"/>
+          <w:sz w:val="20"/>
+          <w:szCs w:val="20"/>
+        </w:rPr>
+      </w:pPr>
+      <w:r>
+        <w:rPr>
+          <w:rFonts w:ascii="Times New Roman" w:hAnsi="Times New Roman" w:cs="Times New Roman"/>
+          <w:sz w:val="20"/>
+          <w:szCs w:val="20"/>
         </w:rPr>
         <w:t xml:space="preserve">Built </w:t>
       </w:r>
       <w:r>
         <w:rPr>
-          <w:rFonts w:ascii="Arial" w:hAnsi="Arial" w:cs="Arial"/>
-          <w:b/>
-          <w:bCs/>
-          <w:sz w:val="16"/>
-          <w:szCs w:val="16"/>
+          <w:rFonts w:ascii="Times New Roman" w:hAnsi="Times New Roman" w:cs="Times New Roman"/>
+          <w:b/>
+          <w:bCs/>
+          <w:sz w:val="20"/>
+          <w:szCs w:val="20"/>
         </w:rPr>
         <w:t>5+ full-stack web projects</w:t>
       </w:r>
       <w:r>
         <w:rPr>
-          <w:rFonts w:ascii="Arial" w:hAnsi="Arial" w:cs="Arial"/>
-          <w:sz w:val="16"/>
-          <w:szCs w:val="16"/>
+          <w:rFonts w:ascii="Times New Roman" w:hAnsi="Times New Roman" w:cs="Times New Roman"/>
+          <w:sz w:val="20"/>
+          <w:szCs w:val="20"/>
         </w:rPr>
         <w:t>, showcasing skills across frontend and backend.</w:t>
       </w:r>
@@ -1980,16 +1844,16 @@
       <w:pPr>
         <w:spacing w:line="360" w:lineRule="auto"/>
         <w:rPr>
-          <w:rFonts w:ascii="Arial" w:hAnsi="Arial" w:cs="Arial"/>
-          <w:sz w:val="16"/>
-          <w:szCs w:val="16"/>
-        </w:rPr>
-      </w:pPr>
-      <w:r>
-        <w:rPr>
-          <w:rFonts w:ascii="Arial" w:hAnsi="Arial" w:cs="Arial"/>
-          <w:sz w:val="16"/>
-          <w:szCs w:val="16"/>
+          <w:rFonts w:ascii="Times New Roman" w:hAnsi="Times New Roman" w:cs="Times New Roman"/>
+          <w:sz w:val="20"/>
+          <w:szCs w:val="20"/>
+        </w:rPr>
+      </w:pPr>
+      <w:r>
+        <w:rPr>
+          <w:rFonts w:ascii="Times New Roman" w:hAnsi="Times New Roman" w:cs="Times New Roman"/>
+          <w:sz w:val="20"/>
+          <w:szCs w:val="20"/>
         </w:rPr>
         <w:pict w14:anchorId="67A91CC9">
           <v:rect id="_x0000_i1031" style="width:0;height:1.5pt" o:hralign="center" o:hrstd="t" o:hr="t" fillcolor="#a0a0a0" stroked="f"/>
@@ -2000,21 +1864,21 @@
       <w:pPr>
         <w:spacing w:line="360" w:lineRule="auto"/>
         <w:rPr>
-          <w:rFonts w:ascii="Arial" w:hAnsi="Arial" w:cs="Arial"/>
-          <w:b/>
-          <w:bCs/>
-          <w:sz w:val="16"/>
-          <w:szCs w:val="16"/>
+          <w:rFonts w:ascii="Times New Roman" w:hAnsi="Times New Roman" w:cs="Times New Roman"/>
+          <w:b/>
+          <w:bCs/>
+          <w:sz w:val="20"/>
+          <w:szCs w:val="20"/>
           <w:u w:val="single"/>
         </w:rPr>
       </w:pPr>
       <w:r>
         <w:rPr>
-          <w:rFonts w:ascii="Arial" w:hAnsi="Arial" w:cs="Arial"/>
-          <w:b/>
-          <w:bCs/>
-          <w:sz w:val="16"/>
-          <w:szCs w:val="16"/>
+          <w:rFonts w:ascii="Times New Roman" w:hAnsi="Times New Roman" w:cs="Times New Roman"/>
+          <w:b/>
+          <w:bCs/>
+          <w:sz w:val="20"/>
+          <w:szCs w:val="20"/>
           <w:u w:val="single"/>
         </w:rPr>
         <w:t>Additional Highlights:</w:t>
@@ -2028,26 +1892,26 @@
         </w:numPr>
         <w:spacing w:line="360" w:lineRule="auto"/>
         <w:rPr>
-          <w:rFonts w:ascii="Arial" w:hAnsi="Arial" w:cs="Arial"/>
-          <w:sz w:val="16"/>
-          <w:szCs w:val="16"/>
-        </w:rPr>
-      </w:pPr>
-      <w:r>
-        <w:rPr>
-          <w:rFonts w:ascii="Arial" w:hAnsi="Arial" w:cs="Arial"/>
-          <w:b/>
-          <w:bCs/>
-          <w:sz w:val="16"/>
-          <w:szCs w:val="16"/>
+          <w:rFonts w:ascii="Times New Roman" w:hAnsi="Times New Roman" w:cs="Times New Roman"/>
+          <w:sz w:val="20"/>
+          <w:szCs w:val="20"/>
+        </w:rPr>
+      </w:pPr>
+      <w:r>
+        <w:rPr>
+          <w:rFonts w:ascii="Times New Roman" w:hAnsi="Times New Roman" w:cs="Times New Roman"/>
+          <w:b/>
+          <w:bCs/>
+          <w:sz w:val="20"/>
+          <w:szCs w:val="20"/>
         </w:rPr>
         <w:t>Leadership:</w:t>
       </w:r>
       <w:r>
         <w:rPr>
-          <w:rFonts w:ascii="Arial" w:hAnsi="Arial" w:cs="Arial"/>
-          <w:sz w:val="16"/>
-          <w:szCs w:val="16"/>
+          <w:rFonts w:ascii="Times New Roman" w:hAnsi="Times New Roman" w:cs="Times New Roman"/>
+          <w:sz w:val="20"/>
+          <w:szCs w:val="20"/>
         </w:rPr>
         <w:t xml:space="preserve"> Led cross-functional teams to successful project completion under tight deadlines.</w:t>
       </w:r>
@@ -2060,26 +1924,26 @@
         </w:numPr>
         <w:spacing w:line="360" w:lineRule="auto"/>
         <w:rPr>
-          <w:rFonts w:ascii="Arial" w:hAnsi="Arial" w:cs="Arial"/>
-          <w:sz w:val="16"/>
-          <w:szCs w:val="16"/>
-        </w:rPr>
-      </w:pPr>
-      <w:r>
-        <w:rPr>
-          <w:rFonts w:ascii="Arial" w:hAnsi="Arial" w:cs="Arial"/>
-          <w:b/>
-          <w:bCs/>
-          <w:sz w:val="16"/>
-          <w:szCs w:val="16"/>
+          <w:rFonts w:ascii="Times New Roman" w:hAnsi="Times New Roman" w:cs="Times New Roman"/>
+          <w:sz w:val="20"/>
+          <w:szCs w:val="20"/>
+        </w:rPr>
+      </w:pPr>
+      <w:r>
+        <w:rPr>
+          <w:rFonts w:ascii="Times New Roman" w:hAnsi="Times New Roman" w:cs="Times New Roman"/>
+          <w:b/>
+          <w:bCs/>
+          <w:sz w:val="20"/>
+          <w:szCs w:val="20"/>
         </w:rPr>
         <w:t>Problem-Solving:</w:t>
       </w:r>
       <w:r>
         <w:rPr>
-          <w:rFonts w:ascii="Arial" w:hAnsi="Arial" w:cs="Arial"/>
-          <w:sz w:val="16"/>
-          <w:szCs w:val="16"/>
+          <w:rFonts w:ascii="Times New Roman" w:hAnsi="Times New Roman" w:cs="Times New Roman"/>
+          <w:sz w:val="20"/>
+          <w:szCs w:val="20"/>
         </w:rPr>
         <w:t xml:space="preserve"> Solved critical production issues, ensuring uninterrupted business operations.</w:t>
       </w:r>
@@ -2092,44 +1956,44 @@
         </w:numPr>
         <w:spacing w:line="360" w:lineRule="auto"/>
         <w:rPr>
-          <w:rFonts w:ascii="Arial" w:hAnsi="Arial" w:cs="Arial"/>
-          <w:sz w:val="16"/>
-          <w:szCs w:val="16"/>
-        </w:rPr>
-      </w:pPr>
-      <w:r>
-        <w:rPr>
-          <w:rFonts w:ascii="Arial" w:hAnsi="Arial" w:cs="Arial"/>
-          <w:b/>
-          <w:bCs/>
-          <w:sz w:val="16"/>
-          <w:szCs w:val="16"/>
+          <w:rFonts w:ascii="Times New Roman" w:hAnsi="Times New Roman" w:cs="Times New Roman"/>
+          <w:sz w:val="20"/>
+          <w:szCs w:val="20"/>
+        </w:rPr>
+      </w:pPr>
+      <w:r>
+        <w:rPr>
+          <w:rFonts w:ascii="Times New Roman" w:hAnsi="Times New Roman" w:cs="Times New Roman"/>
+          <w:b/>
+          <w:bCs/>
+          <w:sz w:val="20"/>
+          <w:szCs w:val="20"/>
         </w:rPr>
         <w:t>Innovation:</w:t>
       </w:r>
       <w:r>
         <w:rPr>
-          <w:rFonts w:ascii="Arial" w:hAnsi="Arial" w:cs="Arial"/>
-          <w:sz w:val="16"/>
-          <w:szCs w:val="16"/>
+          <w:rFonts w:ascii="Times New Roman" w:hAnsi="Times New Roman" w:cs="Times New Roman"/>
+          <w:sz w:val="20"/>
+          <w:szCs w:val="20"/>
         </w:rPr>
         <w:t xml:space="preserve"> Proposed and implemented solutions that </w:t>
       </w:r>
       <w:r>
         <w:rPr>
-          <w:rFonts w:ascii="Arial" w:hAnsi="Arial" w:cs="Arial"/>
-          <w:b/>
-          <w:bCs/>
-          <w:sz w:val="16"/>
-          <w:szCs w:val="16"/>
+          <w:rFonts w:ascii="Times New Roman" w:hAnsi="Times New Roman" w:cs="Times New Roman"/>
+          <w:b/>
+          <w:bCs/>
+          <w:sz w:val="20"/>
+          <w:szCs w:val="20"/>
         </w:rPr>
         <w:t>reduced operational costs by 20%</w:t>
       </w:r>
       <w:r>
         <w:rPr>
-          <w:rFonts w:ascii="Arial" w:hAnsi="Arial" w:cs="Arial"/>
-          <w:sz w:val="16"/>
-          <w:szCs w:val="16"/>
+          <w:rFonts w:ascii="Times New Roman" w:hAnsi="Times New Roman" w:cs="Times New Roman"/>
+          <w:sz w:val="20"/>
+          <w:szCs w:val="20"/>
         </w:rPr>
         <w:t>.</w:t>
       </w:r>
@@ -2142,85 +2006,65 @@
         </w:numPr>
         <w:spacing w:line="360" w:lineRule="auto"/>
         <w:rPr>
-          <w:rFonts w:ascii="Arial" w:hAnsi="Arial" w:cs="Arial"/>
-          <w:sz w:val="16"/>
-          <w:szCs w:val="16"/>
-        </w:rPr>
-      </w:pPr>
-      <w:r>
-        <w:rPr>
-          <w:rFonts w:ascii="Arial" w:hAnsi="Arial" w:cs="Arial"/>
-          <w:b/>
-          <w:bCs/>
-          <w:sz w:val="16"/>
-          <w:szCs w:val="16"/>
+          <w:rFonts w:ascii="Times New Roman" w:hAnsi="Times New Roman" w:cs="Times New Roman"/>
+          <w:sz w:val="20"/>
+          <w:szCs w:val="20"/>
+        </w:rPr>
+      </w:pPr>
+      <w:r>
+        <w:rPr>
+          <w:rFonts w:ascii="Times New Roman" w:hAnsi="Times New Roman" w:cs="Times New Roman"/>
+          <w:b/>
+          <w:bCs/>
+          <w:sz w:val="20"/>
+          <w:szCs w:val="20"/>
         </w:rPr>
         <w:t>Continuous Learning:</w:t>
       </w:r>
       <w:r>
         <w:rPr>
-          <w:rFonts w:ascii="Arial" w:hAnsi="Arial" w:cs="Arial"/>
-          <w:sz w:val="16"/>
-          <w:szCs w:val="16"/>
+          <w:rFonts w:ascii="Times New Roman" w:hAnsi="Times New Roman" w:cs="Times New Roman"/>
+          <w:sz w:val="20"/>
+          <w:szCs w:val="20"/>
         </w:rPr>
         <w:t xml:space="preserve"> Actively upskilling in </w:t>
       </w:r>
       <w:r>
         <w:rPr>
-          <w:rFonts w:ascii="Arial" w:hAnsi="Arial" w:cs="Arial"/>
-          <w:b/>
-          <w:bCs/>
-          <w:sz w:val="16"/>
-          <w:szCs w:val="16"/>
+          <w:rFonts w:ascii="Times New Roman" w:hAnsi="Times New Roman" w:cs="Times New Roman"/>
+          <w:b/>
+          <w:bCs/>
+          <w:sz w:val="20"/>
+          <w:szCs w:val="20"/>
         </w:rPr>
         <w:t>cloud technologies</w:t>
       </w:r>
       <w:r>
         <w:rPr>
-          <w:rFonts w:ascii="Arial" w:hAnsi="Arial" w:cs="Arial"/>
-          <w:sz w:val="16"/>
-          <w:szCs w:val="16"/>
+          <w:rFonts w:ascii="Times New Roman" w:hAnsi="Times New Roman" w:cs="Times New Roman"/>
+          <w:sz w:val="20"/>
+          <w:szCs w:val="20"/>
         </w:rPr>
         <w:t xml:space="preserve"> and </w:t>
       </w:r>
       <w:r>
         <w:rPr>
-          <w:rFonts w:ascii="Arial" w:hAnsi="Arial" w:cs="Arial"/>
-          <w:b/>
-          <w:bCs/>
-          <w:sz w:val="16"/>
-          <w:szCs w:val="16"/>
+          <w:rFonts w:ascii="Times New Roman" w:hAnsi="Times New Roman" w:cs="Times New Roman"/>
+          <w:b/>
+          <w:bCs/>
+          <w:sz w:val="20"/>
+          <w:szCs w:val="20"/>
         </w:rPr>
         <w:t>system design</w:t>
       </w:r>
       <w:r>
         <w:rPr>
-          <w:rFonts w:ascii="Arial" w:hAnsi="Arial" w:cs="Arial"/>
-          <w:sz w:val="16"/>
-          <w:szCs w:val="16"/>
+          <w:rFonts w:ascii="Times New Roman" w:hAnsi="Times New Roman" w:cs="Times New Roman"/>
+          <w:sz w:val="20"/>
+          <w:szCs w:val="20"/>
         </w:rPr>
         <w:t xml:space="preserve"> to stay ahead in the tech domain.</w:t>
       </w:r>
-    </w:p>
-    <w:p>
-      <w:pPr>
-        <w:spacing w:line="360" w:lineRule="auto"/>
-        <w:rPr>
-          <w:rFonts w:ascii="Arial" w:hAnsi="Arial" w:cs="Arial"/>
-          <w:sz w:val="16"/>
-          <w:szCs w:val="16"/>
-        </w:rPr>
-      </w:pPr>
-    </w:p>
-    <w:p>
-      <w:pPr>
-        <w:spacing w:line="360" w:lineRule="auto"/>
-        <w:rPr>
-          <w:rFonts w:ascii="Arial" w:hAnsi="Arial" w:cs="Arial"/>
-          <w:sz w:val="16"/>
-          <w:szCs w:val="16"/>
-        </w:rPr>
-      </w:pPr>
     </w:p>
     <w:sectPr>
       <w:pgSz w:w="12240" w:h="15840"/>
@@ -3806,7 +3650,6 @@
   <w:style w:type="character" w:default="1" w:styleId="DefaultParagraphFont">
     <w:name w:val="Default Paragraph Font"/>
     <w:uiPriority w:val="1"/>
-    <w:semiHidden/>
     <w:unhideWhenUsed/>
   </w:style>
   <w:style w:type="table" w:default="1" w:styleId="TableNormal">

</xml_diff>